<commit_message>
docs: CAROIC appendix for student manual & glossary, briefings update, backend router refinements
</commit_message>
<xml_diff>
--- a/Muressons_Simulation_Briefings.docx
+++ b/Muressons_Simulation_Briefings.docx
@@ -138,7 +138,7 @@
         <w:pStyle w:val="ListNumber"/>
       </w:pPr>
       <w:r>
-        <w:t>11. Mathematical Engine: Formulae &amp; Sample Calculations</w:t>
+        <w:t>11. Side Track: BRSR &amp; NGRBC Compliance (5 Rounds)</w:t>
       </w:r>
     </w:p>
     <w:p>
@@ -146,7 +146,7 @@
         <w:pStyle w:val="ListNumber"/>
       </w:pPr>
       <w:r>
-        <w:t>12. Investment Matrix: How Capital Allocation Impacts Round Outcomes</w:t>
+        <w:t>12. Side Track: Corporate SDG Alignment (5 Rounds)</w:t>
       </w:r>
     </w:p>
     <w:p>
@@ -154,7 +154,7 @@
         <w:pStyle w:val="ListNumber"/>
       </w:pPr>
       <w:r>
-        <w:t>13. Investment-to-Score Rationale: Why Investment Improves Player Scores</w:t>
+        <w:t>13. Mathematical Engine: Formulae &amp; Sample Calculations</w:t>
       </w:r>
     </w:p>
     <w:p>
@@ -162,7 +162,23 @@
         <w:pStyle w:val="ListNumber"/>
       </w:pPr>
       <w:r>
-        <w:t>14. Full Game Walkthrough: Climate Black Swan (Rounds 1-10)</w:t>
+        <w:t>14. Investment Matrix: How Capital Allocation Impacts Round Outcomes</w:t>
+      </w:r>
+    </w:p>
+    <w:p>
+      <w:pPr>
+        <w:pStyle w:val="ListNumber"/>
+      </w:pPr>
+      <w:r>
+        <w:t>15. Investment-to-Score Rationale: Why Investment Improves Player Scores</w:t>
+      </w:r>
+    </w:p>
+    <w:p>
+      <w:pPr>
+        <w:pStyle w:val="ListNumber"/>
+      </w:pPr>
+      <w:r>
+        <w:t>16. Full Game Walkthrough: Climate Black Swan (Rounds 1-10)</w:t>
       </w:r>
     </w:p>
     <w:p>
@@ -1462,7 +1478,7 @@
           <w:i w:val="0"/>
           <w:sz w:val="22"/>
         </w:rPr>
-        <w:t>The financial stakes are real. Scope 3 emissions will eventually feed into your Natural Capital Debt (NCD) — a running tally of your environmental liability that compounds over rounds and directly affects your Year 3 Terminal Valuation. Ignoring it now means paying more later.</w:t>
+        <w:t>The financial stakes are real. Scope 3 emissions will eventually feed into your Natural Capital Debt (NCD) — a running tally of your environmental liability that compounds over rounds and directly affects your Year 5 Terminal Valuation. Ignoring it now means paying more later.</w:t>
       </w:r>
     </w:p>
     <w:p>
@@ -2461,7 +2477,7 @@
           <w:i w:val="0"/>
           <w:sz w:val="22"/>
         </w:rPr>
-        <w:t>The implications extend beyond this round. Your resilience strategy here feeds into your Year 3 Regenerative Multiple. Choosing the insurance-only path signals to investors that you are not building genuine climate resilience — and it will block a critical +0.20 bonus in your final valuation.</w:t>
+        <w:t>The implications extend beyond this round. Your resilience strategy here feeds into your Year 5 Regenerative Multiple. Choosing the insurance-only path signals to investors that you are not building genuine climate resilience — and it will block a critical +0.20 bonus in your final valuation.</w:t>
       </w:r>
     </w:p>
     <w:p>
@@ -2516,6 +2532,17 @@
           <w:sz w:val="22"/>
         </w:rPr>
         <w:t>Consider the Natural Capital Debt implications of each approach</w:t>
+      </w:r>
+    </w:p>
+    <w:p>
+      <w:pPr>
+        <w:pStyle w:val="ListBullet"/>
+      </w:pPr>
+      <w:r>
+        <w:rPr>
+          <w:sz w:val="22"/>
+        </w:rPr>
+        <w:t>⚖️ Complete the mandatory Shadow Board Audit — your board will review your ESG governance posture before allowing strategy access</w:t>
       </w:r>
     </w:p>
     <w:p>
@@ -2981,7 +3008,7 @@
           <w:i w:val="0"/>
           <w:sz w:val="22"/>
         </w:rPr>
-        <w:t>You face a profound ethical crossroads. A full Ethical AI Overhaul costs $8M but builds genuine social capital and unlocks the coveted Truth Premium at Round 10 — a +0.15 bonus to your Regenerative Multiple. A quiet patch costs only $1M but increases governance risk by 10 points. Your choice here will echo through your Year 3 Terminal Valuation and define what kind of company Muressons truly is.</w:t>
+        <w:t>You face a profound ethical crossroads. A full Ethical AI Overhaul costs $8M but builds genuine social capital and unlocks the coveted Truth Premium at Round 10 — a +0.15 bonus to your Regenerative Multiple. A quiet patch costs only $1M but increases governance risk by 10 points. Your choice here will echo through your Year 5 Terminal Valuation and define what kind of company Muressons truly is.</w:t>
       </w:r>
     </w:p>
     <w:p>
@@ -4900,7 +4927,7 @@
         <w:rPr>
           <w:color w:val="1A1A2E"/>
         </w:rPr>
-        <w:t>Round 10: 🏛️ Grand Finale — Year 3 Activist Ultimatum &amp; Terminal Valuation</w:t>
+        <w:t>Round 10: 🏛️ Grand Finale — Year 5 Activist Ultimatum &amp; Terminal Valuation</w:t>
       </w:r>
     </w:p>
     <w:p>
@@ -4920,7 +4947,7 @@
           <w:i w:val="0"/>
           <w:sz w:val="22"/>
         </w:rPr>
-        <w:t>Three years have passed. An activist investor consortium — the FutureFirst Alliance — has acquired a blocking stake in Muressons Global. Led by Dr. Amara Osei, a former climate scientist turned institutional investor, the Alliance tables a formal motion to dissolve the conglomerate structure at a special Board meeting.</w:t>
+        <w:t>Five years have passed. An activist investor consortium — the FutureFirst Alliance — has acquired a blocking stake in Muressons Global. Led by Dr. Amara Osei, a former climate scientist turned institutional investor, the Alliance tables a formal motion to dissolve the conglomerate structure at a special Board meeting.</w:t>
       </w:r>
     </w:p>
     <w:p>
@@ -4982,7 +5009,7 @@
         <w:rPr>
           <w:sz w:val="22"/>
         </w:rPr>
-        <w:t>This round determines your Year 3 Profile Archetype and Terminal Valuation</w:t>
+        <w:t>This round determines your Year 5 Profile Archetype and Terminal Valuation</w:t>
       </w:r>
     </w:p>
     <w:p>
@@ -5039,7 +5066,7 @@
           <w:i w:val="0"/>
           <w:sz w:val="22"/>
         </w:rPr>
-        <w:t>An activist investor consortium has acquired a blocking stake. They are demanding a strategic restructuring. The board must decide the company's Year 3 trajectory.</w:t>
+        <w:t>An activist investor consortium has acquired a blocking stake. They are demanding a strategic restructuring. The board must decide the company's Year 5 trajectory.</w:t>
       </w:r>
     </w:p>
     <w:p>
@@ -7224,6 +7251,39 @@
       </w:r>
     </w:p>
     <w:p>
+      <w:pPr>
+        <w:pStyle w:val="ListBullet"/>
+      </w:pPr>
+      <w:r>
+        <w:rPr>
+          <w:sz w:val="22"/>
+        </w:rPr>
+        <w:t>📚 JENSEN &amp; MECKLING (1976) AGENCY THEORY: The Shareholder persona argues managers must maximise shareholder value and cash retention. This is the primary fiduciary duty under traditional agency theory.</w:t>
+      </w:r>
+    </w:p>
+    <w:p>
+      <w:pPr>
+        <w:pStyle w:val="ListBullet"/>
+      </w:pPr>
+      <w:r>
+        <w:rPr>
+          <w:sz w:val="22"/>
+        </w:rPr>
+        <w:t>🌿 COSTANZA ET AL. (1997) NATURAL CAPITAL: The Activist persona argues for the value of ecosystem services. Nature-based solutions outperform grey infrastructure over 30-year horizons.</w:t>
+      </w:r>
+    </w:p>
+    <w:p>
+      <w:pPr>
+        <w:pStyle w:val="ListBullet"/>
+      </w:pPr>
+      <w:r>
+        <w:rPr>
+          <w:sz w:val="22"/>
+        </w:rPr>
+        <w:t>⚖️ IFC PERFORMANCE STANDARD 1 (2012): The Auditor persona argues fiduciary duty extends to physical climate risk preparedness and assessment/management of environmental and social risks.</w:t>
+      </w:r>
+    </w:p>
+    <w:p>
       <w:r>
         <w:rPr>
           <w:b/>
@@ -11332,7 +11392,7 @@
           <w:i w:val="0"/>
           <w:sz w:val="22"/>
         </w:rPr>
-        <w:t>Your choice directly impacts your final Regenerative Multiple in Year 3. A system that cannot withstand the weather cannot be called sustainable.</w:t>
+        <w:t>Your choice directly impacts your final Regenerative Multiple in Year 5. A system that cannot withstand the weather cannot be called sustainable.</w:t>
       </w:r>
     </w:p>
     <w:p>
@@ -11376,6 +11436,17 @@
           <w:sz w:val="22"/>
         </w:rPr>
         <w:t>Understand how resilience mitigating protects your balance sheet</w:t>
+      </w:r>
+    </w:p>
+    <w:p>
+      <w:pPr>
+        <w:pStyle w:val="ListBullet"/>
+      </w:pPr>
+      <w:r>
+        <w:rPr>
+          <w:sz w:val="22"/>
+        </w:rPr>
+        <w:t>⚖️ Complete the mandatory Shadow Board Audit — your board will review your ESG governance posture before allowing strategy access</w:t>
       </w:r>
     </w:p>
     <w:p>
@@ -13484,7 +13555,7 @@
           <w:i w:val="0"/>
           <w:sz w:val="22"/>
         </w:rPr>
-        <w:t>Three years of relentless crisis management culminate today. A dominant, health-focused activist investor consortium—the FutureFirst Alliance—has acquired a controlling stake in Muressons Healthcare.</w:t>
+        <w:t>Five years of relentless crisis management culminate today. A dominant, health-focused activist investor consortium—the FutureFirst Alliance—has acquired a controlling stake in Muressons Healthcare.</w:t>
       </w:r>
     </w:p>
     <w:p>
@@ -23458,7 +23529,7 @@
               <w:rPr>
                 <w:sz w:val="18"/>
               </w:rPr>
-              <w:t>Obtain limited assurance on climate metrics, publish a roadmap to reasonable assurance by Year 3, and implement basic data quality checks.</w:t>
+              <w:t>Obtain limited assurance on climate metrics, publish a roadmap to reasonable assurance by Year 5, and implement basic data quality checks.</w:t>
             </w:r>
           </w:p>
         </w:tc>
@@ -23887,7 +23958,28 @@
         <w:rPr>
           <w:color w:val="1A1A2E"/>
         </w:rPr>
-        <w:t>11. Mathematical Engine: Formulae &amp; Sample Calculations</w:t>
+        <w:t>11. Side Track: BRSR &amp; NGRBC Compliance (5 Rounds)</w:t>
+      </w:r>
+    </w:p>
+    <w:p>
+      <w:pPr>
+        <w:pStyle w:val="Heading2"/>
+      </w:pPr>
+      <w:r>
+        <w:rPr>
+          <w:color w:val="1A1A2E"/>
+        </w:rPr>
+        <w:t>Round 1: Governance &amp; Transparency (P1 &amp; P7)</w:t>
+      </w:r>
+    </w:p>
+    <w:p>
+      <w:r>
+        <w:rPr>
+          <w:b/>
+          <w:i w:val="0"/>
+          <w:sz w:val="22"/>
+        </w:rPr>
+        <w:t>📋 SEBI BRSR Mandate Triggers</w:t>
       </w:r>
     </w:p>
     <w:p>
@@ -23897,6 +23989,2764 @@
           <w:i w:val="0"/>
           <w:sz w:val="22"/>
         </w:rPr>
+        <w:t>SEBI notifies the top 1,000 listed companies. Muressons must establish a BRSR Steering Committee. The MCA's NGRBC guidelines require a signed Board declaration. Political contributions from the Consumer Goods BU's lobbying in Delhi surface in an RTI query.</w:t>
+      </w:r>
+    </w:p>
+    <w:p>
+      <w:r>
+        <w:rPr>
+          <w:b/>
+          <w:i w:val="0"/>
+          <w:sz w:val="22"/>
+        </w:rPr>
+        <w:t>Decision Options:</w:t>
+      </w:r>
+    </w:p>
+    <w:tbl>
+      <w:tblPr>
+        <w:tblStyle w:val="LightGrid-Accent1"/>
+        <w:tblW w:type="auto" w:w="0"/>
+        <w:jc w:val="center"/>
+        <w:tblLook w:firstColumn="1" w:firstRow="1" w:lastColumn="0" w:lastRow="0" w:noHBand="0" w:noVBand="1" w:val="04A0"/>
+      </w:tblPr>
+      <w:tblGrid>
+        <w:gridCol w:w="2268"/>
+        <w:gridCol w:w="2268"/>
+        <w:gridCol w:w="2268"/>
+        <w:gridCol w:w="2268"/>
+      </w:tblGrid>
+      <w:tr>
+        <w:tc>
+          <w:tcPr>
+            <w:tcW w:type="dxa" w:w="2268"/>
+          </w:tcPr>
+          <w:p>
+            <w:r>
+              <w:rPr>
+                <w:b/>
+                <w:sz w:val="20"/>
+              </w:rPr>
+              <w:t>Option</w:t>
+            </w:r>
+          </w:p>
+        </w:tc>
+        <w:tc>
+          <w:tcPr>
+            <w:tcW w:type="dxa" w:w="2268"/>
+          </w:tcPr>
+          <w:p>
+            <w:r>
+              <w:rPr>
+                <w:b/>
+                <w:sz w:val="20"/>
+              </w:rPr>
+              <w:t>Title</w:t>
+            </w:r>
+          </w:p>
+        </w:tc>
+        <w:tc>
+          <w:tcPr>
+            <w:tcW w:type="dxa" w:w="2268"/>
+          </w:tcPr>
+          <w:p>
+            <w:r>
+              <w:rPr>
+                <w:b/>
+                <w:sz w:val="20"/>
+              </w:rPr>
+              <w:t>Description</w:t>
+            </w:r>
+          </w:p>
+        </w:tc>
+        <w:tc>
+          <w:tcPr>
+            <w:tcW w:type="dxa" w:w="2268"/>
+          </w:tcPr>
+          <w:p>
+            <w:r>
+              <w:rPr>
+                <w:b/>
+                <w:sz w:val="20"/>
+              </w:rPr>
+              <w:t>Key Impacts</w:t>
+            </w:r>
+          </w:p>
+        </w:tc>
+      </w:tr>
+      <w:tr>
+        <w:tc>
+          <w:tcPr>
+            <w:tcW w:type="dxa" w:w="2268"/>
+          </w:tcPr>
+          <w:p>
+            <w:r>
+              <w:rPr>
+                <w:sz w:val="18"/>
+              </w:rPr>
+              <w:t>A</w:t>
+            </w:r>
+          </w:p>
+        </w:tc>
+        <w:tc>
+          <w:tcPr>
+            <w:tcW w:type="dxa" w:w="2268"/>
+          </w:tcPr>
+          <w:p>
+            <w:r>
+              <w:rPr>
+                <w:sz w:val="18"/>
+              </w:rPr>
+              <w:t>Radical Transparency (Leadership Indicator)</w:t>
+            </w:r>
+          </w:p>
+        </w:tc>
+        <w:tc>
+          <w:tcPr>
+            <w:tcW w:type="dxa" w:w="2268"/>
+          </w:tcPr>
+          <w:p>
+            <w:r>
+              <w:rPr>
+                <w:sz w:val="18"/>
+              </w:rPr>
+              <w:t>Establish a Board-level ESG Committee, publish a public lobbying register, roll out ethics training across the value chain, and appoint an independent ethics officer. Exceeds Essential requirements.</w:t>
+            </w:r>
+          </w:p>
+        </w:tc>
+        <w:tc>
+          <w:tcPr>
+            <w:tcW w:type="dxa" w:w="2268"/>
+          </w:tcPr>
+          <w:p>
+            <w:r>
+              <w:rPr>
+                <w:sz w:val="18"/>
+              </w:rPr>
+              <w:t>treasury: $-4M</w:t>
+              <w:br/>
+              <w:t>reputation: +10</w:t>
+              <w:br/>
+              <w:t>governance_risk_delta: -8</w:t>
+            </w:r>
+          </w:p>
+        </w:tc>
+      </w:tr>
+      <w:tr>
+        <w:tc>
+          <w:tcPr>
+            <w:tcW w:type="dxa" w:w="2268"/>
+          </w:tcPr>
+          <w:p>
+            <w:r>
+              <w:rPr>
+                <w:sz w:val="18"/>
+              </w:rPr>
+              <w:t>B</w:t>
+            </w:r>
+          </w:p>
+        </w:tc>
+        <w:tc>
+          <w:tcPr>
+            <w:tcW w:type="dxa" w:w="2268"/>
+          </w:tcPr>
+          <w:p>
+            <w:r>
+              <w:rPr>
+                <w:sz w:val="18"/>
+              </w:rPr>
+              <w:t>Standard Compliance (Essential Indicators)</w:t>
+            </w:r>
+          </w:p>
+        </w:tc>
+        <w:tc>
+          <w:tcPr>
+            <w:tcW w:type="dxa" w:w="2268"/>
+          </w:tcPr>
+          <w:p>
+            <w:r>
+              <w:rPr>
+                <w:sz w:val="18"/>
+              </w:rPr>
+              <w:t>Adopt a standard code of conduct, whistle-blower policy, and conflict of interest disclosures. Meets all Essential Indicators for Principle 1 and Principle 7.</w:t>
+            </w:r>
+          </w:p>
+        </w:tc>
+        <w:tc>
+          <w:tcPr>
+            <w:tcW w:type="dxa" w:w="2268"/>
+          </w:tcPr>
+          <w:p>
+            <w:r>
+              <w:rPr>
+                <w:sz w:val="18"/>
+              </w:rPr>
+              <w:t>treasury: $-2M</w:t>
+              <w:br/>
+              <w:t>reputation: +5</w:t>
+              <w:br/>
+              <w:t>governance_risk_delta: -3</w:t>
+            </w:r>
+          </w:p>
+        </w:tc>
+      </w:tr>
+      <w:tr>
+        <w:tc>
+          <w:tcPr>
+            <w:tcW w:type="dxa" w:w="2268"/>
+          </w:tcPr>
+          <w:p>
+            <w:r>
+              <w:rPr>
+                <w:sz w:val="18"/>
+              </w:rPr>
+              <w:t>C</w:t>
+            </w:r>
+          </w:p>
+        </w:tc>
+        <w:tc>
+          <w:tcPr>
+            <w:tcW w:type="dxa" w:w="2268"/>
+          </w:tcPr>
+          <w:p>
+            <w:r>
+              <w:rPr>
+                <w:sz w:val="18"/>
+              </w:rPr>
+              <w:t>Reactive Disclosure (Below Compliance)</w:t>
+            </w:r>
+          </w:p>
+        </w:tc>
+        <w:tc>
+          <w:tcPr>
+            <w:tcW w:type="dxa" w:w="2268"/>
+          </w:tcPr>
+          <w:p>
+            <w:r>
+              <w:rPr>
+                <w:sz w:val="18"/>
+              </w:rPr>
+              <w:t>Fulfill only mandatory basic disclosures. Delay establishing a Board-level committee and rely on the existing compliance team. Risks a SEBI show-cause notice.</w:t>
+            </w:r>
+          </w:p>
+        </w:tc>
+        <w:tc>
+          <w:tcPr>
+            <w:tcW w:type="dxa" w:w="2268"/>
+          </w:tcPr>
+          <w:p>
+            <w:r>
+              <w:rPr>
+                <w:sz w:val="18"/>
+              </w:rPr>
+              <w:t>treasury: -500000</w:t>
+              <w:br/>
+              <w:t>reputation: -5</w:t>
+              <w:br/>
+              <w:t>governance_risk_delta: +10</w:t>
+            </w:r>
+          </w:p>
+        </w:tc>
+      </w:tr>
+    </w:tbl>
+    <w:p/>
+    <w:p>
+      <w:pPr>
+        <w:pStyle w:val="Heading2"/>
+      </w:pPr>
+      <w:r>
+        <w:rPr>
+          <w:color w:val="1A1A2E"/>
+        </w:rPr>
+        <w:t>Round 2: Workforce &amp; Human Rights (P3 &amp; P5)</w:t>
+      </w:r>
+    </w:p>
+    <w:p>
+      <w:r>
+        <w:rPr>
+          <w:b/>
+          <w:i w:val="0"/>
+          <w:sz w:val="22"/>
+        </w:rPr>
+        <w:t>👥 Living Wage Demands &amp; OHS Gaps</w:t>
+      </w:r>
+    </w:p>
+    <w:p>
+      <w:r>
+        <w:rPr>
+          <w:b w:val="0"/>
+          <w:i w:val="0"/>
+          <w:sz w:val="22"/>
+        </w:rPr>
+        <w:t>Electronics BU unions in Chennai demand living wage disclosures, a key Leadership Indicator under Principle 3. Meanwhile, Pharma BU contract workers face Occupational Health &amp; Safety (OHS) gaps at API plants. POSH committee reports also highlight inconsistencies.</w:t>
+      </w:r>
+    </w:p>
+    <w:p>
+      <w:r>
+        <w:rPr>
+          <w:b/>
+          <w:i w:val="0"/>
+          <w:sz w:val="22"/>
+        </w:rPr>
+        <w:t>Decision Options:</w:t>
+      </w:r>
+    </w:p>
+    <w:tbl>
+      <w:tblPr>
+        <w:tblStyle w:val="LightGrid-Accent1"/>
+        <w:tblW w:type="auto" w:w="0"/>
+        <w:jc w:val="center"/>
+        <w:tblLook w:firstColumn="1" w:firstRow="1" w:lastColumn="0" w:lastRow="0" w:noHBand="0" w:noVBand="1" w:val="04A0"/>
+      </w:tblPr>
+      <w:tblGrid>
+        <w:gridCol w:w="2268"/>
+        <w:gridCol w:w="2268"/>
+        <w:gridCol w:w="2268"/>
+        <w:gridCol w:w="2268"/>
+      </w:tblGrid>
+      <w:tr>
+        <w:tc>
+          <w:tcPr>
+            <w:tcW w:type="dxa" w:w="2268"/>
+          </w:tcPr>
+          <w:p>
+            <w:r>
+              <w:rPr>
+                <w:b/>
+                <w:sz w:val="20"/>
+              </w:rPr>
+              <w:t>Option</w:t>
+            </w:r>
+          </w:p>
+        </w:tc>
+        <w:tc>
+          <w:tcPr>
+            <w:tcW w:type="dxa" w:w="2268"/>
+          </w:tcPr>
+          <w:p>
+            <w:r>
+              <w:rPr>
+                <w:b/>
+                <w:sz w:val="20"/>
+              </w:rPr>
+              <w:t>Title</w:t>
+            </w:r>
+          </w:p>
+        </w:tc>
+        <w:tc>
+          <w:tcPr>
+            <w:tcW w:type="dxa" w:w="2268"/>
+          </w:tcPr>
+          <w:p>
+            <w:r>
+              <w:rPr>
+                <w:b/>
+                <w:sz w:val="20"/>
+              </w:rPr>
+              <w:t>Description</w:t>
+            </w:r>
+          </w:p>
+        </w:tc>
+        <w:tc>
+          <w:tcPr>
+            <w:tcW w:type="dxa" w:w="2268"/>
+          </w:tcPr>
+          <w:p>
+            <w:r>
+              <w:rPr>
+                <w:b/>
+                <w:sz w:val="20"/>
+              </w:rPr>
+              <w:t>Key Impacts</w:t>
+            </w:r>
+          </w:p>
+        </w:tc>
+      </w:tr>
+      <w:tr>
+        <w:tc>
+          <w:tcPr>
+            <w:tcW w:type="dxa" w:w="2268"/>
+          </w:tcPr>
+          <w:p>
+            <w:r>
+              <w:rPr>
+                <w:sz w:val="18"/>
+              </w:rPr>
+              <w:t>A</w:t>
+            </w:r>
+          </w:p>
+        </w:tc>
+        <w:tc>
+          <w:tcPr>
+            <w:tcW w:type="dxa" w:w="2268"/>
+          </w:tcPr>
+          <w:p>
+            <w:r>
+              <w:rPr>
+                <w:sz w:val="18"/>
+              </w:rPr>
+              <w:t>Living Wage Standard (Leadership Indicator)</w:t>
+            </w:r>
+          </w:p>
+        </w:tc>
+        <w:tc>
+          <w:tcPr>
+            <w:tcW w:type="dxa" w:w="2268"/>
+          </w:tcPr>
+          <w:p>
+            <w:r>
+              <w:rPr>
+                <w:sz w:val="18"/>
+              </w:rPr>
+              <w:t>Conduct a living wage gap analysis, implement comprehensive DEI dashboards, upgrade OHS to ISO 45001 across all BUs, and perform human rights due diligence for Tier-1 suppliers.</w:t>
+            </w:r>
+          </w:p>
+        </w:tc>
+        <w:tc>
+          <w:tcPr>
+            <w:tcW w:type="dxa" w:w="2268"/>
+          </w:tcPr>
+          <w:p>
+            <w:r>
+              <w:rPr>
+                <w:sz w:val="18"/>
+              </w:rPr>
+              <w:t>treasury: $-8M</w:t>
+              <w:br/>
+              <w:t>social_license_delta: +15</w:t>
+              <w:br/>
+              <w:t>burnout_delta: -12</w:t>
+              <w:br/>
+              <w:t>governance_risk_delta: -5</w:t>
+            </w:r>
+          </w:p>
+        </w:tc>
+      </w:tr>
+      <w:tr>
+        <w:tc>
+          <w:tcPr>
+            <w:tcW w:type="dxa" w:w="2268"/>
+          </w:tcPr>
+          <w:p>
+            <w:r>
+              <w:rPr>
+                <w:sz w:val="18"/>
+              </w:rPr>
+              <w:t>B</w:t>
+            </w:r>
+          </w:p>
+        </w:tc>
+        <w:tc>
+          <w:tcPr>
+            <w:tcW w:type="dxa" w:w="2268"/>
+          </w:tcPr>
+          <w:p>
+            <w:r>
+              <w:rPr>
+                <w:sz w:val="18"/>
+              </w:rPr>
+              <w:t>Safety &amp; POSH Focus (Essential+)</w:t>
+            </w:r>
+          </w:p>
+        </w:tc>
+        <w:tc>
+          <w:tcPr>
+            <w:tcW w:type="dxa" w:w="2268"/>
+          </w:tcPr>
+          <w:p>
+            <w:r>
+              <w:rPr>
+                <w:sz w:val="18"/>
+              </w:rPr>
+              <w:t>Mandatory safety upgrades at API plants, disclose gender pay gap data, and remediate POSH compliance issues. Meets Essential indicators and partially addresses Leadership expectations.</w:t>
+            </w:r>
+          </w:p>
+        </w:tc>
+        <w:tc>
+          <w:tcPr>
+            <w:tcW w:type="dxa" w:w="2268"/>
+          </w:tcPr>
+          <w:p>
+            <w:r>
+              <w:rPr>
+                <w:sz w:val="18"/>
+              </w:rPr>
+              <w:t>treasury: $-4M</w:t>
+              <w:br/>
+              <w:t>social_license_delta: +5</w:t>
+              <w:br/>
+              <w:t>burnout_delta: -5</w:t>
+            </w:r>
+          </w:p>
+        </w:tc>
+      </w:tr>
+      <w:tr>
+        <w:tc>
+          <w:tcPr>
+            <w:tcW w:type="dxa" w:w="2268"/>
+          </w:tcPr>
+          <w:p>
+            <w:r>
+              <w:rPr>
+                <w:sz w:val="18"/>
+              </w:rPr>
+              <w:t>C</w:t>
+            </w:r>
+          </w:p>
+        </w:tc>
+        <w:tc>
+          <w:tcPr>
+            <w:tcW w:type="dxa" w:w="2268"/>
+          </w:tcPr>
+          <w:p>
+            <w:r>
+              <w:rPr>
+                <w:sz w:val="18"/>
+              </w:rPr>
+              <w:t>Statutory Minimums Only</w:t>
+            </w:r>
+          </w:p>
+        </w:tc>
+        <w:tc>
+          <w:tcPr>
+            <w:tcW w:type="dxa" w:w="2268"/>
+          </w:tcPr>
+          <w:p>
+            <w:r>
+              <w:rPr>
+                <w:sz w:val="18"/>
+              </w:rPr>
+              <w:t>Adhere strictly to legal minimum wage compliance and basic safety records. Fails Leadership Indicators and increases the risk of labor unrest.</w:t>
+            </w:r>
+          </w:p>
+        </w:tc>
+        <w:tc>
+          <w:tcPr>
+            <w:tcW w:type="dxa" w:w="2268"/>
+          </w:tcPr>
+          <w:p>
+            <w:r>
+              <w:rPr>
+                <w:sz w:val="18"/>
+              </w:rPr>
+              <w:t>treasury: 0</w:t>
+              <w:br/>
+              <w:t>social_license_delta: -10</w:t>
+              <w:br/>
+              <w:t>burnout_delta: +5</w:t>
+            </w:r>
+          </w:p>
+        </w:tc>
+      </w:tr>
+    </w:tbl>
+    <w:p/>
+    <w:p>
+      <w:pPr>
+        <w:pStyle w:val="Heading2"/>
+      </w:pPr>
+      <w:r>
+        <w:rPr>
+          <w:color w:val="1A1A2E"/>
+        </w:rPr>
+        <w:t>Round 3: Environment &amp; Circularity (P6 &amp; P2)</w:t>
+      </w:r>
+    </w:p>
+    <w:p>
+      <w:r>
+        <w:rPr>
+          <w:b/>
+          <w:i w:val="0"/>
+          <w:sz w:val="22"/>
+        </w:rPr>
+        <w:t>🌊 API Discharge &amp; EPR Scrutiny</w:t>
+      </w:r>
+    </w:p>
+    <w:p>
+      <w:r>
+        <w:rPr>
+          <w:b w:val="0"/>
+          <w:i w:val="0"/>
+          <w:sz w:val="22"/>
+        </w:rPr>
+        <w:t>The CPCB flags the Pharma BU's water discharge in Hyderabad for API residues. Leadership Indicators require Extended Producer Responsibility (EPR) disclosures for Electronics (e-waste) and Consumer Goods (plastics). BRSR demands Scope 1+2 GHG intensity.</w:t>
+      </w:r>
+    </w:p>
+    <w:p>
+      <w:r>
+        <w:rPr>
+          <w:b/>
+          <w:i w:val="0"/>
+          <w:sz w:val="22"/>
+        </w:rPr>
+        <w:t>Decision Options:</w:t>
+      </w:r>
+    </w:p>
+    <w:tbl>
+      <w:tblPr>
+        <w:tblStyle w:val="LightGrid-Accent1"/>
+        <w:tblW w:type="auto" w:w="0"/>
+        <w:jc w:val="center"/>
+        <w:tblLook w:firstColumn="1" w:firstRow="1" w:lastColumn="0" w:lastRow="0" w:noHBand="0" w:noVBand="1" w:val="04A0"/>
+      </w:tblPr>
+      <w:tblGrid>
+        <w:gridCol w:w="2268"/>
+        <w:gridCol w:w="2268"/>
+        <w:gridCol w:w="2268"/>
+        <w:gridCol w:w="2268"/>
+      </w:tblGrid>
+      <w:tr>
+        <w:tc>
+          <w:tcPr>
+            <w:tcW w:type="dxa" w:w="2268"/>
+          </w:tcPr>
+          <w:p>
+            <w:r>
+              <w:rPr>
+                <w:b/>
+                <w:sz w:val="20"/>
+              </w:rPr>
+              <w:t>Option</w:t>
+            </w:r>
+          </w:p>
+        </w:tc>
+        <w:tc>
+          <w:tcPr>
+            <w:tcW w:type="dxa" w:w="2268"/>
+          </w:tcPr>
+          <w:p>
+            <w:r>
+              <w:rPr>
+                <w:b/>
+                <w:sz w:val="20"/>
+              </w:rPr>
+              <w:t>Title</w:t>
+            </w:r>
+          </w:p>
+        </w:tc>
+        <w:tc>
+          <w:tcPr>
+            <w:tcW w:type="dxa" w:w="2268"/>
+          </w:tcPr>
+          <w:p>
+            <w:r>
+              <w:rPr>
+                <w:b/>
+                <w:sz w:val="20"/>
+              </w:rPr>
+              <w:t>Description</w:t>
+            </w:r>
+          </w:p>
+        </w:tc>
+        <w:tc>
+          <w:tcPr>
+            <w:tcW w:type="dxa" w:w="2268"/>
+          </w:tcPr>
+          <w:p>
+            <w:r>
+              <w:rPr>
+                <w:b/>
+                <w:sz w:val="20"/>
+              </w:rPr>
+              <w:t>Key Impacts</w:t>
+            </w:r>
+          </w:p>
+        </w:tc>
+      </w:tr>
+      <w:tr>
+        <w:tc>
+          <w:tcPr>
+            <w:tcW w:type="dxa" w:w="2268"/>
+          </w:tcPr>
+          <w:p>
+            <w:r>
+              <w:rPr>
+                <w:sz w:val="18"/>
+              </w:rPr>
+              <w:t>A</w:t>
+            </w:r>
+          </w:p>
+        </w:tc>
+        <w:tc>
+          <w:tcPr>
+            <w:tcW w:type="dxa" w:w="2268"/>
+          </w:tcPr>
+          <w:p>
+            <w:r>
+              <w:rPr>
+                <w:sz w:val="18"/>
+              </w:rPr>
+              <w:t>Circular Symbiosis &amp; ZLD (Leadership)</w:t>
+            </w:r>
+          </w:p>
+        </w:tc>
+        <w:tc>
+          <w:tcPr>
+            <w:tcW w:type="dxa" w:w="2268"/>
+          </w:tcPr>
+          <w:p>
+            <w:r>
+              <w:rPr>
+                <w:sz w:val="18"/>
+              </w:rPr>
+              <w:t>Deploy Zero Liquid Discharge (ZLD) for Pharma, full EPR compliance for all BUs, a Waste-to-Energy partnership, Scope 3 mapping, and biodiversity impact assessment.</w:t>
+            </w:r>
+          </w:p>
+        </w:tc>
+        <w:tc>
+          <w:tcPr>
+            <w:tcW w:type="dxa" w:w="2268"/>
+          </w:tcPr>
+          <w:p>
+            <w:r>
+              <w:rPr>
+                <w:sz w:val="18"/>
+              </w:rPr>
+              <w:t>treasury: $-10M</w:t>
+              <w:br/>
+              <w:t>natural_capital_debt_delta: -15</w:t>
+              <w:br/>
+              <w:t>carbon_intensity_delta: -5</w:t>
+            </w:r>
+          </w:p>
+        </w:tc>
+      </w:tr>
+      <w:tr>
+        <w:tc>
+          <w:tcPr>
+            <w:tcW w:type="dxa" w:w="2268"/>
+          </w:tcPr>
+          <w:p>
+            <w:r>
+              <w:rPr>
+                <w:sz w:val="18"/>
+              </w:rPr>
+              <w:t>B</w:t>
+            </w:r>
+          </w:p>
+        </w:tc>
+        <w:tc>
+          <w:tcPr>
+            <w:tcW w:type="dxa" w:w="2268"/>
+          </w:tcPr>
+          <w:p>
+            <w:r>
+              <w:rPr>
+                <w:sz w:val="18"/>
+              </w:rPr>
+              <w:t>Efficiency Upgrades &amp; EPR (Essential+)</w:t>
+            </w:r>
+          </w:p>
+        </w:tc>
+        <w:tc>
+          <w:tcPr>
+            <w:tcW w:type="dxa" w:w="2268"/>
+          </w:tcPr>
+          <w:p>
+            <w:r>
+              <w:rPr>
+                <w:sz w:val="18"/>
+              </w:rPr>
+              <w:t>Implement high-efficiency water recycling, comprehensive Scope 1+2 reporting, EPR registration, and standard waste segregation. Partially addresses Leadership metrics.</w:t>
+            </w:r>
+          </w:p>
+        </w:tc>
+        <w:tc>
+          <w:tcPr>
+            <w:tcW w:type="dxa" w:w="2268"/>
+          </w:tcPr>
+          <w:p>
+            <w:r>
+              <w:rPr>
+                <w:sz w:val="18"/>
+              </w:rPr>
+              <w:t>treasury: $-6M</w:t>
+              <w:br/>
+              <w:t>natural_capital_debt_delta: -8</w:t>
+            </w:r>
+          </w:p>
+        </w:tc>
+      </w:tr>
+      <w:tr>
+        <w:tc>
+          <w:tcPr>
+            <w:tcW w:type="dxa" w:w="2268"/>
+          </w:tcPr>
+          <w:p>
+            <w:r>
+              <w:rPr>
+                <w:sz w:val="18"/>
+              </w:rPr>
+              <w:t>C</w:t>
+            </w:r>
+          </w:p>
+        </w:tc>
+        <w:tc>
+          <w:tcPr>
+            <w:tcW w:type="dxa" w:w="2268"/>
+          </w:tcPr>
+          <w:p>
+            <w:r>
+              <w:rPr>
+                <w:sz w:val="18"/>
+              </w:rPr>
+              <w:t>Regulatory Minimums</w:t>
+            </w:r>
+          </w:p>
+        </w:tc>
+        <w:tc>
+          <w:tcPr>
+            <w:tcW w:type="dxa" w:w="2268"/>
+          </w:tcPr>
+          <w:p>
+            <w:r>
+              <w:rPr>
+                <w:sz w:val="18"/>
+              </w:rPr>
+              <w:t>Pay standard environmental levies and submit minimal waste reporting. Fails Leadership requirements and risks further CPCB penalties.</w:t>
+            </w:r>
+          </w:p>
+        </w:tc>
+        <w:tc>
+          <w:tcPr>
+            <w:tcW w:type="dxa" w:w="2268"/>
+          </w:tcPr>
+          <w:p>
+            <w:r>
+              <w:rPr>
+                <w:sz w:val="18"/>
+              </w:rPr>
+              <w:t>treasury: $-2M</w:t>
+              <w:br/>
+              <w:t>natural_capital_debt_delta: +5</w:t>
+              <w:br/>
+              <w:t>carbon_intensity_delta: +2</w:t>
+            </w:r>
+          </w:p>
+        </w:tc>
+      </w:tr>
+    </w:tbl>
+    <w:p/>
+    <w:p>
+      <w:pPr>
+        <w:pStyle w:val="Heading2"/>
+      </w:pPr>
+      <w:r>
+        <w:rPr>
+          <w:color w:val="1A1A2E"/>
+        </w:rPr>
+        <w:t>Round 4: Value Chain &amp; BRSR Core</w:t>
+      </w:r>
+    </w:p>
+    <w:p>
+      <w:r>
+        <w:rPr>
+          <w:b/>
+          <w:i w:val="0"/>
+          <w:sz w:val="22"/>
+        </w:rPr>
+        <w:t>🔍 BRSR Core Reasonable Assurance</w:t>
+      </w:r>
+    </w:p>
+    <w:p>
+      <w:r>
+        <w:rPr>
+          <w:b w:val="0"/>
+          <w:i w:val="0"/>
+          <w:sz w:val="22"/>
+        </w:rPr>
+        <w:t>SEBI introduces 'BRSR Core' for value chain disclosures. Muressons falls in the top 250 glide path, making reasonable assurance mandatory for 9 key attributes. Concurrently, Tier-2 electronics suppliers face scrutiny for child labor, and CG faces a product recall.</w:t>
+      </w:r>
+    </w:p>
+    <w:p>
+      <w:r>
+        <w:rPr>
+          <w:b/>
+          <w:i w:val="0"/>
+          <w:sz w:val="22"/>
+        </w:rPr>
+        <w:t>Decision Options:</w:t>
+      </w:r>
+    </w:p>
+    <w:tbl>
+      <w:tblPr>
+        <w:tblStyle w:val="LightGrid-Accent1"/>
+        <w:tblW w:type="auto" w:w="0"/>
+        <w:jc w:val="center"/>
+        <w:tblLook w:firstColumn="1" w:firstRow="1" w:lastColumn="0" w:lastRow="0" w:noHBand="0" w:noVBand="1" w:val="04A0"/>
+      </w:tblPr>
+      <w:tblGrid>
+        <w:gridCol w:w="2268"/>
+        <w:gridCol w:w="2268"/>
+        <w:gridCol w:w="2268"/>
+        <w:gridCol w:w="2268"/>
+      </w:tblGrid>
+      <w:tr>
+        <w:tc>
+          <w:tcPr>
+            <w:tcW w:type="dxa" w:w="2268"/>
+          </w:tcPr>
+          <w:p>
+            <w:r>
+              <w:rPr>
+                <w:b/>
+                <w:sz w:val="20"/>
+              </w:rPr>
+              <w:t>Option</w:t>
+            </w:r>
+          </w:p>
+        </w:tc>
+        <w:tc>
+          <w:tcPr>
+            <w:tcW w:type="dxa" w:w="2268"/>
+          </w:tcPr>
+          <w:p>
+            <w:r>
+              <w:rPr>
+                <w:b/>
+                <w:sz w:val="20"/>
+              </w:rPr>
+              <w:t>Title</w:t>
+            </w:r>
+          </w:p>
+        </w:tc>
+        <w:tc>
+          <w:tcPr>
+            <w:tcW w:type="dxa" w:w="2268"/>
+          </w:tcPr>
+          <w:p>
+            <w:r>
+              <w:rPr>
+                <w:b/>
+                <w:sz w:val="20"/>
+              </w:rPr>
+              <w:t>Description</w:t>
+            </w:r>
+          </w:p>
+        </w:tc>
+        <w:tc>
+          <w:tcPr>
+            <w:tcW w:type="dxa" w:w="2268"/>
+          </w:tcPr>
+          <w:p>
+            <w:r>
+              <w:rPr>
+                <w:b/>
+                <w:sz w:val="20"/>
+              </w:rPr>
+              <w:t>Key Impacts</w:t>
+            </w:r>
+          </w:p>
+        </w:tc>
+      </w:tr>
+      <w:tr>
+        <w:tc>
+          <w:tcPr>
+            <w:tcW w:type="dxa" w:w="2268"/>
+          </w:tcPr>
+          <w:p>
+            <w:r>
+              <w:rPr>
+                <w:sz w:val="18"/>
+              </w:rPr>
+              <w:t>A</w:t>
+            </w:r>
+          </w:p>
+        </w:tc>
+        <w:tc>
+          <w:tcPr>
+            <w:tcW w:type="dxa" w:w="2268"/>
+          </w:tcPr>
+          <w:p>
+            <w:r>
+              <w:rPr>
+                <w:sz w:val="18"/>
+              </w:rPr>
+              <w:t>Multi-Tier Assurance (Leadership)</w:t>
+            </w:r>
+          </w:p>
+        </w:tc>
+        <w:tc>
+          <w:tcPr>
+            <w:tcW w:type="dxa" w:w="2268"/>
+          </w:tcPr>
+          <w:p>
+            <w:r>
+              <w:rPr>
+                <w:sz w:val="18"/>
+              </w:rPr>
+              <w:t>Implement blockchain-based supply chain traceability, reasonable assurance engagement with Big 4, MSME supplier development programs, and advanced consumer grievance analytics.</w:t>
+            </w:r>
+          </w:p>
+        </w:tc>
+        <w:tc>
+          <w:tcPr>
+            <w:tcW w:type="dxa" w:w="2268"/>
+          </w:tcPr>
+          <w:p>
+            <w:r>
+              <w:rPr>
+                <w:sz w:val="18"/>
+              </w:rPr>
+              <w:t>treasury: $-6M</w:t>
+              <w:br/>
+              <w:t>reputation: +12</w:t>
+              <w:br/>
+              <w:t>governance_risk_delta: -10</w:t>
+            </w:r>
+          </w:p>
+        </w:tc>
+      </w:tr>
+      <w:tr>
+        <w:tc>
+          <w:tcPr>
+            <w:tcW w:type="dxa" w:w="2268"/>
+          </w:tcPr>
+          <w:p>
+            <w:r>
+              <w:rPr>
+                <w:sz w:val="18"/>
+              </w:rPr>
+              <w:t>B</w:t>
+            </w:r>
+          </w:p>
+        </w:tc>
+        <w:tc>
+          <w:tcPr>
+            <w:tcW w:type="dxa" w:w="2268"/>
+          </w:tcPr>
+          <w:p>
+            <w:r>
+              <w:rPr>
+                <w:sz w:val="18"/>
+              </w:rPr>
+              <w:t>Tier-1 Screening (Essential)</w:t>
+            </w:r>
+          </w:p>
+        </w:tc>
+        <w:tc>
+          <w:tcPr>
+            <w:tcW w:type="dxa" w:w="2268"/>
+          </w:tcPr>
+          <w:p>
+            <w:r>
+              <w:rPr>
+                <w:sz w:val="18"/>
+              </w:rPr>
+              <w:t>Conduct Tier-1 supplier audits, limited assurance engagement, and document CSR spend. Meets Essential requirements for value chain reporting.</w:t>
+            </w:r>
+          </w:p>
+        </w:tc>
+        <w:tc>
+          <w:tcPr>
+            <w:tcW w:type="dxa" w:w="2268"/>
+          </w:tcPr>
+          <w:p>
+            <w:r>
+              <w:rPr>
+                <w:sz w:val="18"/>
+              </w:rPr>
+              <w:t>treasury: $-2M</w:t>
+              <w:br/>
+              <w:t>reputation: +4</w:t>
+              <w:br/>
+              <w:t>governance_risk_delta: -3</w:t>
+            </w:r>
+          </w:p>
+        </w:tc>
+      </w:tr>
+      <w:tr>
+        <w:tc>
+          <w:tcPr>
+            <w:tcW w:type="dxa" w:w="2268"/>
+          </w:tcPr>
+          <w:p>
+            <w:r>
+              <w:rPr>
+                <w:sz w:val="18"/>
+              </w:rPr>
+              <w:t>C</w:t>
+            </w:r>
+          </w:p>
+        </w:tc>
+        <w:tc>
+          <w:tcPr>
+            <w:tcW w:type="dxa" w:w="2268"/>
+          </w:tcPr>
+          <w:p>
+            <w:r>
+              <w:rPr>
+                <w:sz w:val="18"/>
+              </w:rPr>
+              <w:t>Self-Assessment Only</w:t>
+            </w:r>
+          </w:p>
+        </w:tc>
+        <w:tc>
+          <w:tcPr>
+            <w:tcW w:type="dxa" w:w="2268"/>
+          </w:tcPr>
+          <w:p>
+            <w:r>
+              <w:rPr>
+                <w:sz w:val="18"/>
+              </w:rPr>
+              <w:t>Rely entirely on supplier questionnaires and internal verification. Sets Greenwash Risk flag and creates significant SEBI compliance vulnerability.</w:t>
+            </w:r>
+          </w:p>
+        </w:tc>
+        <w:tc>
+          <w:tcPr>
+            <w:tcW w:type="dxa" w:w="2268"/>
+          </w:tcPr>
+          <w:p>
+            <w:r>
+              <w:rPr>
+                <w:sz w:val="18"/>
+              </w:rPr>
+              <w:t>treasury: -500000</w:t>
+              <w:br/>
+              <w:t>reputation: -8</w:t>
+              <w:br/>
+              <w:t>governance_risk_delta: +8</w:t>
+            </w:r>
+          </w:p>
+        </w:tc>
+      </w:tr>
+    </w:tbl>
+    <w:p/>
+    <w:p>
+      <w:pPr>
+        <w:pStyle w:val="Heading2"/>
+      </w:pPr>
+      <w:r>
+        <w:rPr>
+          <w:color w:val="1A1A2E"/>
+        </w:rPr>
+        <w:t>Round 5: Integrated Disclosure &amp; ESG Alpha</w:t>
+      </w:r>
+    </w:p>
+    <w:p>
+      <w:r>
+        <w:rPr>
+          <w:b/>
+          <w:i w:val="0"/>
+          <w:sz w:val="22"/>
+        </w:rPr>
+        <w:t>💎 The Final Report &amp; ESG Alpha</w:t>
+      </w:r>
+    </w:p>
+    <w:p>
+      <w:r>
+        <w:rPr>
+          <w:b w:val="0"/>
+          <w:i w:val="0"/>
+          <w:sz w:val="22"/>
+        </w:rPr>
+        <w:t>FY-end approaches. The Board demands the final BRSR filing. The Investor Relations team must present the ESG narrative. CRISIL ESG and Sustainalytics are benchmarking Muressons against peers. The choice: How deeply do you integrate sustainability into corporate identity?</w:t>
+      </w:r>
+    </w:p>
+    <w:p>
+      <w:r>
+        <w:rPr>
+          <w:b/>
+          <w:i w:val="0"/>
+          <w:sz w:val="22"/>
+        </w:rPr>
+        <w:t>Decision Options:</w:t>
+      </w:r>
+    </w:p>
+    <w:tbl>
+      <w:tblPr>
+        <w:tblStyle w:val="LightGrid-Accent1"/>
+        <w:tblW w:type="auto" w:w="0"/>
+        <w:jc w:val="center"/>
+        <w:tblLook w:firstColumn="1" w:firstRow="1" w:lastColumn="0" w:lastRow="0" w:noHBand="0" w:noVBand="1" w:val="04A0"/>
+      </w:tblPr>
+      <w:tblGrid>
+        <w:gridCol w:w="2268"/>
+        <w:gridCol w:w="2268"/>
+        <w:gridCol w:w="2268"/>
+        <w:gridCol w:w="2268"/>
+      </w:tblGrid>
+      <w:tr>
+        <w:tc>
+          <w:tcPr>
+            <w:tcW w:type="dxa" w:w="2268"/>
+          </w:tcPr>
+          <w:p>
+            <w:r>
+              <w:rPr>
+                <w:b/>
+                <w:sz w:val="20"/>
+              </w:rPr>
+              <w:t>Option</w:t>
+            </w:r>
+          </w:p>
+        </w:tc>
+        <w:tc>
+          <w:tcPr>
+            <w:tcW w:type="dxa" w:w="2268"/>
+          </w:tcPr>
+          <w:p>
+            <w:r>
+              <w:rPr>
+                <w:b/>
+                <w:sz w:val="20"/>
+              </w:rPr>
+              <w:t>Title</w:t>
+            </w:r>
+          </w:p>
+        </w:tc>
+        <w:tc>
+          <w:tcPr>
+            <w:tcW w:type="dxa" w:w="2268"/>
+          </w:tcPr>
+          <w:p>
+            <w:r>
+              <w:rPr>
+                <w:b/>
+                <w:sz w:val="20"/>
+              </w:rPr>
+              <w:t>Description</w:t>
+            </w:r>
+          </w:p>
+        </w:tc>
+        <w:tc>
+          <w:tcPr>
+            <w:tcW w:type="dxa" w:w="2268"/>
+          </w:tcPr>
+          <w:p>
+            <w:r>
+              <w:rPr>
+                <w:b/>
+                <w:sz w:val="20"/>
+              </w:rPr>
+              <w:t>Key Impacts</w:t>
+            </w:r>
+          </w:p>
+        </w:tc>
+      </w:tr>
+      <w:tr>
+        <w:tc>
+          <w:tcPr>
+            <w:tcW w:type="dxa" w:w="2268"/>
+          </w:tcPr>
+          <w:p>
+            <w:r>
+              <w:rPr>
+                <w:sz w:val="18"/>
+              </w:rPr>
+              <w:t>A</w:t>
+            </w:r>
+          </w:p>
+        </w:tc>
+        <w:tc>
+          <w:tcPr>
+            <w:tcW w:type="dxa" w:w="2268"/>
+          </w:tcPr>
+          <w:p>
+            <w:r>
+              <w:rPr>
+                <w:sz w:val="18"/>
+              </w:rPr>
+              <w:t>Integrated Report (Leadership)</w:t>
+            </w:r>
+          </w:p>
+        </w:tc>
+        <w:tc>
+          <w:tcPr>
+            <w:tcW w:type="dxa" w:w="2268"/>
+          </w:tcPr>
+          <w:p>
+            <w:r>
+              <w:rPr>
+                <w:sz w:val="18"/>
+              </w:rPr>
+              <w:t>Publish a Six Capitals integrated report (IIRC), ESG-Financial connectivity dashboard, third-party materiality validation, and GRI/TCFD cross-references. Prevents Exit Multiple haircut.</w:t>
+            </w:r>
+          </w:p>
+        </w:tc>
+        <w:tc>
+          <w:tcPr>
+            <w:tcW w:type="dxa" w:w="2268"/>
+          </w:tcPr>
+          <w:p>
+            <w:r>
+              <w:rPr>
+                <w:sz w:val="18"/>
+              </w:rPr>
+              <w:t>treasury: $-4M</w:t>
+              <w:br/>
+              <w:t>reputation: +15</w:t>
+            </w:r>
+          </w:p>
+        </w:tc>
+      </w:tr>
+      <w:tr>
+        <w:tc>
+          <w:tcPr>
+            <w:tcW w:type="dxa" w:w="2268"/>
+          </w:tcPr>
+          <w:p>
+            <w:r>
+              <w:rPr>
+                <w:sz w:val="18"/>
+              </w:rPr>
+              <w:t>B</w:t>
+            </w:r>
+          </w:p>
+        </w:tc>
+        <w:tc>
+          <w:tcPr>
+            <w:tcW w:type="dxa" w:w="2268"/>
+          </w:tcPr>
+          <w:p>
+            <w:r>
+              <w:rPr>
+                <w:sz w:val="18"/>
+              </w:rPr>
+              <w:t>Strategic BRSR (Essential+)</w:t>
+            </w:r>
+          </w:p>
+        </w:tc>
+        <w:tc>
+          <w:tcPr>
+            <w:tcW w:type="dxa" w:w="2268"/>
+          </w:tcPr>
+          <w:p>
+            <w:r>
+              <w:rPr>
+                <w:sz w:val="18"/>
+              </w:rPr>
+              <w:t>Provide a structured BRSR aligned with performance KPIs, sector benchmarking, and a basic materiality matrix.</w:t>
+            </w:r>
+          </w:p>
+        </w:tc>
+        <w:tc>
+          <w:tcPr>
+            <w:tcW w:type="dxa" w:w="2268"/>
+          </w:tcPr>
+          <w:p>
+            <w:r>
+              <w:rPr>
+                <w:sz w:val="18"/>
+              </w:rPr>
+              <w:t>treasury: $-2M</w:t>
+              <w:br/>
+              <w:t>reputation: +6</w:t>
+            </w:r>
+          </w:p>
+        </w:tc>
+      </w:tr>
+      <w:tr>
+        <w:tc>
+          <w:tcPr>
+            <w:tcW w:type="dxa" w:w="2268"/>
+          </w:tcPr>
+          <w:p>
+            <w:r>
+              <w:rPr>
+                <w:sz w:val="18"/>
+              </w:rPr>
+              <w:t>C</w:t>
+            </w:r>
+          </w:p>
+        </w:tc>
+        <w:tc>
+          <w:tcPr>
+            <w:tcW w:type="dxa" w:w="2268"/>
+          </w:tcPr>
+          <w:p>
+            <w:r>
+              <w:rPr>
+                <w:sz w:val="18"/>
+              </w:rPr>
+              <w:t>Compliance File</w:t>
+            </w:r>
+          </w:p>
+        </w:tc>
+        <w:tc>
+          <w:tcPr>
+            <w:tcW w:type="dxa" w:w="2268"/>
+          </w:tcPr>
+          <w:p>
+            <w:r>
+              <w:rPr>
+                <w:sz w:val="18"/>
+              </w:rPr>
+              <w:t>Submit a basic statutory BRSR filing with minimal narrative context. Blocks Truth Premium bonus.</w:t>
+            </w:r>
+          </w:p>
+        </w:tc>
+        <w:tc>
+          <w:tcPr>
+            <w:tcW w:type="dxa" w:w="2268"/>
+          </w:tcPr>
+          <w:p>
+            <w:r>
+              <w:rPr>
+                <w:sz w:val="18"/>
+              </w:rPr>
+              <w:t>treasury: -500000</w:t>
+              <w:br/>
+              <w:t>reputation: -3</w:t>
+            </w:r>
+          </w:p>
+        </w:tc>
+      </w:tr>
+    </w:tbl>
+    <w:p/>
+    <w:p>
+      <w:r>
+        <w:br w:type="page"/>
+      </w:r>
+    </w:p>
+    <w:p>
+      <w:pPr>
+        <w:pStyle w:val="Heading1"/>
+      </w:pPr>
+      <w:r>
+        <w:rPr>
+          <w:color w:val="1A1A2E"/>
+        </w:rPr>
+        <w:t>12. Side Track: Corporate SDG Alignment (5 Rounds)</w:t>
+      </w:r>
+    </w:p>
+    <w:p>
+      <w:pPr>
+        <w:pStyle w:val="Heading2"/>
+      </w:pPr>
+      <w:r>
+        <w:rPr>
+          <w:color w:val="1A1A2E"/>
+        </w:rPr>
+        <w:t>Round 1: Principal Adverse Impact (PAI) Audit</w:t>
+      </w:r>
+    </w:p>
+    <w:p>
+      <w:r>
+        <w:rPr>
+          <w:b/>
+          <w:i w:val="0"/>
+          <w:sz w:val="22"/>
+        </w:rPr>
+        <w:t>Decision Options:</w:t>
+      </w:r>
+    </w:p>
+    <w:tbl>
+      <w:tblPr>
+        <w:tblStyle w:val="LightGrid-Accent1"/>
+        <w:tblW w:type="auto" w:w="0"/>
+        <w:jc w:val="center"/>
+        <w:tblLook w:firstColumn="1" w:firstRow="1" w:lastColumn="0" w:lastRow="0" w:noHBand="0" w:noVBand="1" w:val="04A0"/>
+      </w:tblPr>
+      <w:tblGrid>
+        <w:gridCol w:w="2268"/>
+        <w:gridCol w:w="2268"/>
+        <w:gridCol w:w="2268"/>
+        <w:gridCol w:w="2268"/>
+      </w:tblGrid>
+      <w:tr>
+        <w:tc>
+          <w:tcPr>
+            <w:tcW w:type="dxa" w:w="2268"/>
+          </w:tcPr>
+          <w:p>
+            <w:r>
+              <w:rPr>
+                <w:b/>
+                <w:sz w:val="20"/>
+              </w:rPr>
+              <w:t>Option</w:t>
+            </w:r>
+          </w:p>
+        </w:tc>
+        <w:tc>
+          <w:tcPr>
+            <w:tcW w:type="dxa" w:w="2268"/>
+          </w:tcPr>
+          <w:p>
+            <w:r>
+              <w:rPr>
+                <w:b/>
+                <w:sz w:val="20"/>
+              </w:rPr>
+              <w:t>Title</w:t>
+            </w:r>
+          </w:p>
+        </w:tc>
+        <w:tc>
+          <w:tcPr>
+            <w:tcW w:type="dxa" w:w="2268"/>
+          </w:tcPr>
+          <w:p>
+            <w:r>
+              <w:rPr>
+                <w:b/>
+                <w:sz w:val="20"/>
+              </w:rPr>
+              <w:t>Description</w:t>
+            </w:r>
+          </w:p>
+        </w:tc>
+        <w:tc>
+          <w:tcPr>
+            <w:tcW w:type="dxa" w:w="2268"/>
+          </w:tcPr>
+          <w:p>
+            <w:r>
+              <w:rPr>
+                <w:b/>
+                <w:sz w:val="20"/>
+              </w:rPr>
+              <w:t>Key Impacts</w:t>
+            </w:r>
+          </w:p>
+        </w:tc>
+      </w:tr>
+      <w:tr>
+        <w:tc>
+          <w:tcPr>
+            <w:tcW w:type="dxa" w:w="2268"/>
+          </w:tcPr>
+          <w:p>
+            <w:r>
+              <w:rPr>
+                <w:sz w:val="18"/>
+              </w:rPr>
+              <w:t>Forensic PAI Audit</w:t>
+            </w:r>
+          </w:p>
+        </w:tc>
+        <w:tc>
+          <w:tcPr>
+            <w:tcW w:type="dxa" w:w="2268"/>
+          </w:tcPr>
+          <w:p>
+            <w:r>
+              <w:rPr>
+                <w:sz w:val="18"/>
+              </w:rPr>
+            </w:r>
+          </w:p>
+        </w:tc>
+        <w:tc>
+          <w:tcPr>
+            <w:tcW w:type="dxa" w:w="2268"/>
+          </w:tcPr>
+          <w:p>
+            <w:r>
+              <w:rPr>
+                <w:sz w:val="18"/>
+              </w:rPr>
+              <w:t>Commission a full forensic audit mapping all BU harm pathways to their material SDGs. Expensive but exhaustive.</w:t>
+            </w:r>
+          </w:p>
+        </w:tc>
+        <w:tc>
+          <w:tcPr>
+            <w:tcW w:type="dxa" w:w="2268"/>
+          </w:tcPr>
+          <w:p>
+            <w:r>
+              <w:rPr>
+                <w:sz w:val="18"/>
+              </w:rPr>
+              <w:t>treasury: $-3M</w:t>
+              <w:br/>
+              <w:t>reputation: +10</w:t>
+              <w:br/>
+              <w:t>governance_risk_delta: -8</w:t>
+            </w:r>
+          </w:p>
+        </w:tc>
+      </w:tr>
+      <w:tr>
+        <w:tc>
+          <w:tcPr>
+            <w:tcW w:type="dxa" w:w="2268"/>
+          </w:tcPr>
+          <w:p>
+            <w:r>
+              <w:rPr>
+                <w:sz w:val="18"/>
+              </w:rPr>
+              <w:t>Materiality Review</w:t>
+            </w:r>
+          </w:p>
+        </w:tc>
+        <w:tc>
+          <w:tcPr>
+            <w:tcW w:type="dxa" w:w="2268"/>
+          </w:tcPr>
+          <w:p>
+            <w:r>
+              <w:rPr>
+                <w:sz w:val="18"/>
+              </w:rPr>
+            </w:r>
+          </w:p>
+        </w:tc>
+        <w:tc>
+          <w:tcPr>
+            <w:tcW w:type="dxa" w:w="2268"/>
+          </w:tcPr>
+          <w:p>
+            <w:r>
+              <w:rPr>
+                <w:sz w:val="18"/>
+              </w:rPr>
+              <w:t>Focus only on High Impact areas using existing data. Cost-effective but leaves blind spots in lower-priority BUs.</w:t>
+            </w:r>
+          </w:p>
+        </w:tc>
+        <w:tc>
+          <w:tcPr>
+            <w:tcW w:type="dxa" w:w="2268"/>
+          </w:tcPr>
+          <w:p>
+            <w:r>
+              <w:rPr>
+                <w:sz w:val="18"/>
+              </w:rPr>
+              <w:t>treasury: $-2M</w:t>
+              <w:br/>
+              <w:t>reputation: +5</w:t>
+              <w:br/>
+              <w:t>governance_risk_delta: -3</w:t>
+            </w:r>
+          </w:p>
+        </w:tc>
+      </w:tr>
+      <w:tr>
+        <w:tc>
+          <w:tcPr>
+            <w:tcW w:type="dxa" w:w="2268"/>
+          </w:tcPr>
+          <w:p>
+            <w:r>
+              <w:rPr>
+                <w:sz w:val="18"/>
+              </w:rPr>
+              <w:t>Standard Disclosure</w:t>
+            </w:r>
+          </w:p>
+        </w:tc>
+        <w:tc>
+          <w:tcPr>
+            <w:tcW w:type="dxa" w:w="2268"/>
+          </w:tcPr>
+          <w:p>
+            <w:r>
+              <w:rPr>
+                <w:sz w:val="18"/>
+              </w:rPr>
+            </w:r>
+          </w:p>
+        </w:tc>
+        <w:tc>
+          <w:tcPr>
+            <w:tcW w:type="dxa" w:w="2268"/>
+          </w:tcPr>
+          <w:p>
+            <w:r>
+              <w:rPr>
+                <w:sz w:val="18"/>
+              </w:rPr>
+              <w:t>Minimum SFDR compliance. Publish template disclosures without investigative depth. Sets PAI blindspot.</w:t>
+            </w:r>
+          </w:p>
+        </w:tc>
+        <w:tc>
+          <w:tcPr>
+            <w:tcW w:type="dxa" w:w="2268"/>
+          </w:tcPr>
+          <w:p>
+            <w:r>
+              <w:rPr>
+                <w:sz w:val="18"/>
+              </w:rPr>
+              <w:t>treasury: 0</w:t>
+              <w:br/>
+              <w:t>reputation: 0</w:t>
+              <w:br/>
+              <w:t>governance_risk_delta: 0</w:t>
+            </w:r>
+          </w:p>
+        </w:tc>
+      </w:tr>
+    </w:tbl>
+    <w:p/>
+    <w:p>
+      <w:pPr>
+        <w:pStyle w:val="Heading2"/>
+      </w:pPr>
+      <w:r>
+        <w:rPr>
+          <w:color w:val="1A1A2E"/>
+        </w:rPr>
+        <w:t>Round 2: The Living Wage Strike</w:t>
+      </w:r>
+    </w:p>
+    <w:p>
+      <w:r>
+        <w:rPr>
+          <w:b/>
+          <w:i w:val="0"/>
+          <w:sz w:val="22"/>
+        </w:rPr>
+        <w:t>Decision Options:</w:t>
+      </w:r>
+    </w:p>
+    <w:tbl>
+      <w:tblPr>
+        <w:tblStyle w:val="LightGrid-Accent1"/>
+        <w:tblW w:type="auto" w:w="0"/>
+        <w:jc w:val="center"/>
+        <w:tblLook w:firstColumn="1" w:firstRow="1" w:lastColumn="0" w:lastRow="0" w:noHBand="0" w:noVBand="1" w:val="04A0"/>
+      </w:tblPr>
+      <w:tblGrid>
+        <w:gridCol w:w="2268"/>
+        <w:gridCol w:w="2268"/>
+        <w:gridCol w:w="2268"/>
+        <w:gridCol w:w="2268"/>
+      </w:tblGrid>
+      <w:tr>
+        <w:tc>
+          <w:tcPr>
+            <w:tcW w:type="dxa" w:w="2268"/>
+          </w:tcPr>
+          <w:p>
+            <w:r>
+              <w:rPr>
+                <w:b/>
+                <w:sz w:val="20"/>
+              </w:rPr>
+              <w:t>Option</w:t>
+            </w:r>
+          </w:p>
+        </w:tc>
+        <w:tc>
+          <w:tcPr>
+            <w:tcW w:type="dxa" w:w="2268"/>
+          </w:tcPr>
+          <w:p>
+            <w:r>
+              <w:rPr>
+                <w:b/>
+                <w:sz w:val="20"/>
+              </w:rPr>
+              <w:t>Title</w:t>
+            </w:r>
+          </w:p>
+        </w:tc>
+        <w:tc>
+          <w:tcPr>
+            <w:tcW w:type="dxa" w:w="2268"/>
+          </w:tcPr>
+          <w:p>
+            <w:r>
+              <w:rPr>
+                <w:b/>
+                <w:sz w:val="20"/>
+              </w:rPr>
+              <w:t>Description</w:t>
+            </w:r>
+          </w:p>
+        </w:tc>
+        <w:tc>
+          <w:tcPr>
+            <w:tcW w:type="dxa" w:w="2268"/>
+          </w:tcPr>
+          <w:p>
+            <w:r>
+              <w:rPr>
+                <w:b/>
+                <w:sz w:val="20"/>
+              </w:rPr>
+              <w:t>Key Impacts</w:t>
+            </w:r>
+          </w:p>
+        </w:tc>
+      </w:tr>
+      <w:tr>
+        <w:tc>
+          <w:tcPr>
+            <w:tcW w:type="dxa" w:w="2268"/>
+          </w:tcPr>
+          <w:p>
+            <w:r>
+              <w:rPr>
+                <w:sz w:val="18"/>
+              </w:rPr>
+              <w:t>Living Wage Commitment</w:t>
+            </w:r>
+          </w:p>
+        </w:tc>
+        <w:tc>
+          <w:tcPr>
+            <w:tcW w:type="dxa" w:w="2268"/>
+          </w:tcPr>
+          <w:p>
+            <w:r>
+              <w:rPr>
+                <w:sz w:val="18"/>
+              </w:rPr>
+            </w:r>
+          </w:p>
+        </w:tc>
+        <w:tc>
+          <w:tcPr>
+            <w:tcW w:type="dxa" w:w="2268"/>
+          </w:tcPr>
+          <w:p>
+            <w:r>
+              <w:rPr>
+                <w:sz w:val="18"/>
+              </w:rPr>
+              <w:t>Full legal parity across all Tier-1 suppliers. Immediate compliance with ILO living wage standards.</w:t>
+            </w:r>
+          </w:p>
+        </w:tc>
+        <w:tc>
+          <w:tcPr>
+            <w:tcW w:type="dxa" w:w="2268"/>
+          </w:tcPr>
+          <w:p>
+            <w:r>
+              <w:rPr>
+                <w:sz w:val="18"/>
+              </w:rPr>
+              <w:t>treasury: $-2M</w:t>
+              <w:br/>
+              <w:t>reputation: +15</w:t>
+              <w:br/>
+              <w:t>social_license_delta: +8</w:t>
+            </w:r>
+          </w:p>
+        </w:tc>
+      </w:tr>
+      <w:tr>
+        <w:tc>
+          <w:tcPr>
+            <w:tcW w:type="dxa" w:w="2268"/>
+          </w:tcPr>
+          <w:p>
+            <w:r>
+              <w:rPr>
+                <w:sz w:val="18"/>
+              </w:rPr>
+              <w:t>Phased Wage Parity</w:t>
+            </w:r>
+          </w:p>
+        </w:tc>
+        <w:tc>
+          <w:tcPr>
+            <w:tcW w:type="dxa" w:w="2268"/>
+          </w:tcPr>
+          <w:p>
+            <w:r>
+              <w:rPr>
+                <w:sz w:val="18"/>
+              </w:rPr>
+            </w:r>
+          </w:p>
+        </w:tc>
+        <w:tc>
+          <w:tcPr>
+            <w:tcW w:type="dxa" w:w="2268"/>
+          </w:tcPr>
+          <w:p>
+            <w:r>
+              <w:rPr>
+                <w:sz w:val="18"/>
+              </w:rPr>
+              <w:t>3-year escalation plan with annual benchmarks. Moderate cost, builds workforce readiness over time.</w:t>
+            </w:r>
+          </w:p>
+        </w:tc>
+        <w:tc>
+          <w:tcPr>
+            <w:tcW w:type="dxa" w:w="2268"/>
+          </w:tcPr>
+          <w:p>
+            <w:r>
+              <w:rPr>
+                <w:sz w:val="18"/>
+              </w:rPr>
+              <w:t>treasury: 0</w:t>
+              <w:br/>
+              <w:t>reputation: +6</w:t>
+            </w:r>
+          </w:p>
+        </w:tc>
+      </w:tr>
+      <w:tr>
+        <w:tc>
+          <w:tcPr>
+            <w:tcW w:type="dxa" w:w="2268"/>
+          </w:tcPr>
+          <w:p>
+            <w:r>
+              <w:rPr>
+                <w:sz w:val="18"/>
+              </w:rPr>
+              <w:t>Operational Hardball</w:t>
+            </w:r>
+          </w:p>
+        </w:tc>
+        <w:tc>
+          <w:tcPr>
+            <w:tcW w:type="dxa" w:w="2268"/>
+          </w:tcPr>
+          <w:p>
+            <w:r>
+              <w:rPr>
+                <w:sz w:val="18"/>
+              </w:rPr>
+            </w:r>
+          </w:p>
+        </w:tc>
+        <w:tc>
+          <w:tcPr>
+            <w:tcW w:type="dxa" w:w="2268"/>
+          </w:tcPr>
+          <w:p>
+            <w:r>
+              <w:rPr>
+                <w:sz w:val="18"/>
+              </w:rPr>
+              <w:t>Automation-driven response. Break the strike through technology substitution. Short-term savings, long-term risk.</w:t>
+            </w:r>
+          </w:p>
+        </w:tc>
+        <w:tc>
+          <w:tcPr>
+            <w:tcW w:type="dxa" w:w="2268"/>
+          </w:tcPr>
+          <w:p>
+            <w:r>
+              <w:rPr>
+                <w:sz w:val="18"/>
+              </w:rPr>
+              <w:t>treasury: 0</w:t>
+              <w:br/>
+              <w:t>reputation: -20</w:t>
+            </w:r>
+          </w:p>
+        </w:tc>
+      </w:tr>
+    </w:tbl>
+    <w:p/>
+    <w:p>
+      <w:pPr>
+        <w:pStyle w:val="Heading2"/>
+      </w:pPr>
+      <w:r>
+        <w:rPr>
+          <w:color w:val="1A1A2E"/>
+        </w:rPr>
+        <w:t>Round 3: Circular Procurement Transformation</w:t>
+      </w:r>
+    </w:p>
+    <w:p>
+      <w:r>
+        <w:rPr>
+          <w:b/>
+          <w:i w:val="0"/>
+          <w:sz w:val="22"/>
+        </w:rPr>
+        <w:t>Decision Options:</w:t>
+      </w:r>
+    </w:p>
+    <w:tbl>
+      <w:tblPr>
+        <w:tblStyle w:val="LightGrid-Accent1"/>
+        <w:tblW w:type="auto" w:w="0"/>
+        <w:jc w:val="center"/>
+        <w:tblLook w:firstColumn="1" w:firstRow="1" w:lastColumn="0" w:lastRow="0" w:noHBand="0" w:noVBand="1" w:val="04A0"/>
+      </w:tblPr>
+      <w:tblGrid>
+        <w:gridCol w:w="2268"/>
+        <w:gridCol w:w="2268"/>
+        <w:gridCol w:w="2268"/>
+        <w:gridCol w:w="2268"/>
+      </w:tblGrid>
+      <w:tr>
+        <w:tc>
+          <w:tcPr>
+            <w:tcW w:type="dxa" w:w="2268"/>
+          </w:tcPr>
+          <w:p>
+            <w:r>
+              <w:rPr>
+                <w:b/>
+                <w:sz w:val="20"/>
+              </w:rPr>
+              <w:t>Option</w:t>
+            </w:r>
+          </w:p>
+        </w:tc>
+        <w:tc>
+          <w:tcPr>
+            <w:tcW w:type="dxa" w:w="2268"/>
+          </w:tcPr>
+          <w:p>
+            <w:r>
+              <w:rPr>
+                <w:b/>
+                <w:sz w:val="20"/>
+              </w:rPr>
+              <w:t>Title</w:t>
+            </w:r>
+          </w:p>
+        </w:tc>
+        <w:tc>
+          <w:tcPr>
+            <w:tcW w:type="dxa" w:w="2268"/>
+          </w:tcPr>
+          <w:p>
+            <w:r>
+              <w:rPr>
+                <w:b/>
+                <w:sz w:val="20"/>
+              </w:rPr>
+              <w:t>Description</w:t>
+            </w:r>
+          </w:p>
+        </w:tc>
+        <w:tc>
+          <w:tcPr>
+            <w:tcW w:type="dxa" w:w="2268"/>
+          </w:tcPr>
+          <w:p>
+            <w:r>
+              <w:rPr>
+                <w:b/>
+                <w:sz w:val="20"/>
+              </w:rPr>
+              <w:t>Key Impacts</w:t>
+            </w:r>
+          </w:p>
+        </w:tc>
+      </w:tr>
+      <w:tr>
+        <w:tc>
+          <w:tcPr>
+            <w:tcW w:type="dxa" w:w="2268"/>
+          </w:tcPr>
+          <w:p>
+            <w:r>
+              <w:rPr>
+                <w:sz w:val="18"/>
+              </w:rPr>
+              <w:t>Full Circular Transformation</w:t>
+            </w:r>
+          </w:p>
+        </w:tc>
+        <w:tc>
+          <w:tcPr>
+            <w:tcW w:type="dxa" w:w="2268"/>
+          </w:tcPr>
+          <w:p>
+            <w:r>
+              <w:rPr>
+                <w:sz w:val="18"/>
+              </w:rPr>
+            </w:r>
+          </w:p>
+        </w:tc>
+        <w:tc>
+          <w:tcPr>
+            <w:tcW w:type="dxa" w:w="2268"/>
+          </w:tcPr>
+          <w:p>
+            <w:r>
+              <w:rPr>
+                <w:sz w:val="18"/>
+              </w:rPr>
+              <w:t>Closed-loop redesign of all product lines. Design for disassembly, remanufacturing, and material recovery.</w:t>
+            </w:r>
+          </w:p>
+        </w:tc>
+        <w:tc>
+          <w:tcPr>
+            <w:tcW w:type="dxa" w:w="2268"/>
+          </w:tcPr>
+          <w:p>
+            <w:r>
+              <w:rPr>
+                <w:sz w:val="18"/>
+              </w:rPr>
+              <w:t>treasury: $-4M</w:t>
+              <w:br/>
+              <w:t>natural_capital_debt_delta: -15</w:t>
+            </w:r>
+          </w:p>
+        </w:tc>
+      </w:tr>
+      <w:tr>
+        <w:tc>
+          <w:tcPr>
+            <w:tcW w:type="dxa" w:w="2268"/>
+          </w:tcPr>
+          <w:p>
+            <w:r>
+              <w:rPr>
+                <w:sz w:val="18"/>
+              </w:rPr>
+              <w:t>Targeted Sourcing</w:t>
+            </w:r>
+          </w:p>
+        </w:tc>
+        <w:tc>
+          <w:tcPr>
+            <w:tcW w:type="dxa" w:w="2268"/>
+          </w:tcPr>
+          <w:p>
+            <w:r>
+              <w:rPr>
+                <w:sz w:val="18"/>
+              </w:rPr>
+            </w:r>
+          </w:p>
+        </w:tc>
+        <w:tc>
+          <w:tcPr>
+            <w:tcW w:type="dxa" w:w="2268"/>
+          </w:tcPr>
+          <w:p>
+            <w:r>
+              <w:rPr>
+                <w:sz w:val="18"/>
+              </w:rPr>
+              <w:t>Switch to recycled plastics and metals for high-volume BUs. Partial circularity with manageable disruption.</w:t>
+            </w:r>
+          </w:p>
+        </w:tc>
+        <w:tc>
+          <w:tcPr>
+            <w:tcW w:type="dxa" w:w="2268"/>
+          </w:tcPr>
+          <w:p>
+            <w:r>
+              <w:rPr>
+                <w:sz w:val="18"/>
+              </w:rPr>
+              <w:t>treasury: $-2M</w:t>
+              <w:br/>
+              <w:t>natural_capital_debt_delta: -6</w:t>
+              <w:br/>
+              <w:t>reputation: +4</w:t>
+            </w:r>
+          </w:p>
+        </w:tc>
+      </w:tr>
+      <w:tr>
+        <w:tc>
+          <w:tcPr>
+            <w:tcW w:type="dxa" w:w="2268"/>
+          </w:tcPr>
+          <w:p>
+            <w:r>
+              <w:rPr>
+                <w:sz w:val="18"/>
+              </w:rPr>
+              <w:t>Spot-Market Compliance</w:t>
+            </w:r>
+          </w:p>
+        </w:tc>
+        <w:tc>
+          <w:tcPr>
+            <w:tcW w:type="dxa" w:w="2268"/>
+          </w:tcPr>
+          <w:p>
+            <w:r>
+              <w:rPr>
+                <w:sz w:val="18"/>
+              </w:rPr>
+            </w:r>
+          </w:p>
+        </w:tc>
+        <w:tc>
+          <w:tcPr>
+            <w:tcW w:type="dxa" w:w="2268"/>
+          </w:tcPr>
+          <w:p>
+            <w:r>
+              <w:rPr>
+                <w:sz w:val="18"/>
+              </w:rPr>
+              <w:t>Purchase circularity credits on the open market. Meet regulatory thresholds without operational change.</w:t>
+            </w:r>
+          </w:p>
+        </w:tc>
+        <w:tc>
+          <w:tcPr>
+            <w:tcW w:type="dxa" w:w="2268"/>
+          </w:tcPr>
+          <w:p>
+            <w:r>
+              <w:rPr>
+                <w:sz w:val="18"/>
+              </w:rPr>
+              <w:t>treasury: $-1M</w:t>
+              <w:br/>
+              <w:t>natural_capital_debt_delta: +3</w:t>
+              <w:br/>
+              <w:t>governance_risk_delta: +5</w:t>
+            </w:r>
+          </w:p>
+        </w:tc>
+      </w:tr>
+    </w:tbl>
+    <w:p/>
+    <w:p>
+      <w:pPr>
+        <w:pStyle w:val="Heading2"/>
+      </w:pPr>
+      <w:r>
+        <w:rPr>
+          <w:color w:val="1A1A2E"/>
+        </w:rPr>
+        <w:t>Round 4: Biodiversity Net-Gain Commitment</w:t>
+      </w:r>
+    </w:p>
+    <w:p>
+      <w:r>
+        <w:rPr>
+          <w:b/>
+          <w:i w:val="0"/>
+          <w:sz w:val="22"/>
+        </w:rPr>
+        <w:t>Decision Options:</w:t>
+      </w:r>
+    </w:p>
+    <w:tbl>
+      <w:tblPr>
+        <w:tblStyle w:val="LightGrid-Accent1"/>
+        <w:tblW w:type="auto" w:w="0"/>
+        <w:jc w:val="center"/>
+        <w:tblLook w:firstColumn="1" w:firstRow="1" w:lastColumn="0" w:lastRow="0" w:noHBand="0" w:noVBand="1" w:val="04A0"/>
+      </w:tblPr>
+      <w:tblGrid>
+        <w:gridCol w:w="2268"/>
+        <w:gridCol w:w="2268"/>
+        <w:gridCol w:w="2268"/>
+        <w:gridCol w:w="2268"/>
+      </w:tblGrid>
+      <w:tr>
+        <w:tc>
+          <w:tcPr>
+            <w:tcW w:type="dxa" w:w="2268"/>
+          </w:tcPr>
+          <w:p>
+            <w:r>
+              <w:rPr>
+                <w:b/>
+                <w:sz w:val="20"/>
+              </w:rPr>
+              <w:t>Option</w:t>
+            </w:r>
+          </w:p>
+        </w:tc>
+        <w:tc>
+          <w:tcPr>
+            <w:tcW w:type="dxa" w:w="2268"/>
+          </w:tcPr>
+          <w:p>
+            <w:r>
+              <w:rPr>
+                <w:b/>
+                <w:sz w:val="20"/>
+              </w:rPr>
+              <w:t>Title</w:t>
+            </w:r>
+          </w:p>
+        </w:tc>
+        <w:tc>
+          <w:tcPr>
+            <w:tcW w:type="dxa" w:w="2268"/>
+          </w:tcPr>
+          <w:p>
+            <w:r>
+              <w:rPr>
+                <w:b/>
+                <w:sz w:val="20"/>
+              </w:rPr>
+              <w:t>Description</w:t>
+            </w:r>
+          </w:p>
+        </w:tc>
+        <w:tc>
+          <w:tcPr>
+            <w:tcW w:type="dxa" w:w="2268"/>
+          </w:tcPr>
+          <w:p>
+            <w:r>
+              <w:rPr>
+                <w:b/>
+                <w:sz w:val="20"/>
+              </w:rPr>
+              <w:t>Key Impacts</w:t>
+            </w:r>
+          </w:p>
+        </w:tc>
+      </w:tr>
+      <w:tr>
+        <w:tc>
+          <w:tcPr>
+            <w:tcW w:type="dxa" w:w="2268"/>
+          </w:tcPr>
+          <w:p>
+            <w:r>
+              <w:rPr>
+                <w:sz w:val="18"/>
+              </w:rPr>
+              <w:t>Nature-Positive Transformation</w:t>
+            </w:r>
+          </w:p>
+        </w:tc>
+        <w:tc>
+          <w:tcPr>
+            <w:tcW w:type="dxa" w:w="2268"/>
+          </w:tcPr>
+          <w:p>
+            <w:r>
+              <w:rPr>
+                <w:sz w:val="18"/>
+              </w:rPr>
+            </w:r>
+          </w:p>
+        </w:tc>
+        <w:tc>
+          <w:tcPr>
+            <w:tcW w:type="dxa" w:w="2268"/>
+          </w:tcPr>
+          <w:p>
+            <w:r>
+              <w:rPr>
+                <w:sz w:val="18"/>
+              </w:rPr>
+              <w:t>Full SBTN No-Net-Loss commitment with TNFD disclosure. Restore 2,000 hectares of degraded habitat. Sets nature_positive flag for terminal valuation.</w:t>
+            </w:r>
+          </w:p>
+        </w:tc>
+        <w:tc>
+          <w:tcPr>
+            <w:tcW w:type="dxa" w:w="2268"/>
+          </w:tcPr>
+          <w:p>
+            <w:r>
+              <w:rPr>
+                <w:sz w:val="18"/>
+              </w:rPr>
+              <w:t>treasury: $-6M</w:t>
+              <w:br/>
+              <w:t>natural_capital_debt_delta: -15</w:t>
+              <w:br/>
+              <w:t>reputation: +10</w:t>
+            </w:r>
+          </w:p>
+        </w:tc>
+      </w:tr>
+      <w:tr>
+        <w:tc>
+          <w:tcPr>
+            <w:tcW w:type="dxa" w:w="2268"/>
+          </w:tcPr>
+          <w:p>
+            <w:r>
+              <w:rPr>
+                <w:sz w:val="18"/>
+              </w:rPr>
+              <w:t>Targeted Conservation</w:t>
+            </w:r>
+          </w:p>
+        </w:tc>
+        <w:tc>
+          <w:tcPr>
+            <w:tcW w:type="dxa" w:w="2268"/>
+          </w:tcPr>
+          <w:p>
+            <w:r>
+              <w:rPr>
+                <w:sz w:val="18"/>
+              </w:rPr>
+            </w:r>
+          </w:p>
+        </w:tc>
+        <w:tc>
+          <w:tcPr>
+            <w:tcW w:type="dxa" w:w="2268"/>
+          </w:tcPr>
+          <w:p>
+            <w:r>
+              <w:rPr>
+                <w:sz w:val="18"/>
+              </w:rPr>
+              <w:t>Reforestation of 1,000 hectares in critical supply chain corridors. Partial biodiversity recovery with TNFD alignment.</w:t>
+            </w:r>
+          </w:p>
+        </w:tc>
+        <w:tc>
+          <w:tcPr>
+            <w:tcW w:type="dxa" w:w="2268"/>
+          </w:tcPr>
+          <w:p>
+            <w:r>
+              <w:rPr>
+                <w:sz w:val="18"/>
+              </w:rPr>
+              <w:t>treasury: $-2M</w:t>
+              <w:br/>
+              <w:t>natural_capital_debt_delta: -6</w:t>
+              <w:br/>
+              <w:t>reputation: +4</w:t>
+            </w:r>
+          </w:p>
+        </w:tc>
+      </w:tr>
+      <w:tr>
+        <w:tc>
+          <w:tcPr>
+            <w:tcW w:type="dxa" w:w="2268"/>
+          </w:tcPr>
+          <w:p>
+            <w:r>
+              <w:rPr>
+                <w:sz w:val="18"/>
+              </w:rPr>
+              <w:t>Market-Based Deferral</w:t>
+            </w:r>
+          </w:p>
+        </w:tc>
+        <w:tc>
+          <w:tcPr>
+            <w:tcW w:type="dxa" w:w="2268"/>
+          </w:tcPr>
+          <w:p>
+            <w:r>
+              <w:rPr>
+                <w:sz w:val="18"/>
+              </w:rPr>
+            </w:r>
+          </w:p>
+        </w:tc>
+        <w:tc>
+          <w:tcPr>
+            <w:tcW w:type="dxa" w:w="2268"/>
+          </w:tcPr>
+          <w:p>
+            <w:r>
+              <w:rPr>
+                <w:sz w:val="18"/>
+              </w:rPr>
+              <w:t>Purchase biodiversity credits and defer TNFD compliance. Buy time, but NCD compounds and governance risk increases.</w:t>
+            </w:r>
+          </w:p>
+        </w:tc>
+        <w:tc>
+          <w:tcPr>
+            <w:tcW w:type="dxa" w:w="2268"/>
+          </w:tcPr>
+          <w:p>
+            <w:r>
+              <w:rPr>
+                <w:sz w:val="18"/>
+              </w:rPr>
+              <w:t>treasury: 0</w:t>
+              <w:br/>
+              <w:t>natural_capital_debt_delta: +5</w:t>
+              <w:br/>
+              <w:t>governance_risk_delta: +3</w:t>
+            </w:r>
+          </w:p>
+        </w:tc>
+      </w:tr>
+    </w:tbl>
+    <w:p/>
+    <w:p>
+      <w:pPr>
+        <w:pStyle w:val="Heading2"/>
+      </w:pPr>
+      <w:r>
+        <w:rPr>
+          <w:color w:val="1A1A2E"/>
+        </w:rPr>
+        <w:t>Round 5: Integrated Reporting &amp; Value Creation</w:t>
+      </w:r>
+    </w:p>
+    <w:p>
+      <w:r>
+        <w:rPr>
+          <w:b/>
+          <w:i w:val="0"/>
+          <w:sz w:val="22"/>
+        </w:rPr>
+        <w:t>Decision Options:</w:t>
+      </w:r>
+    </w:p>
+    <w:tbl>
+      <w:tblPr>
+        <w:tblStyle w:val="LightGrid-Accent1"/>
+        <w:tblW w:type="auto" w:w="0"/>
+        <w:jc w:val="center"/>
+        <w:tblLook w:firstColumn="1" w:firstRow="1" w:lastColumn="0" w:lastRow="0" w:noHBand="0" w:noVBand="1" w:val="04A0"/>
+      </w:tblPr>
+      <w:tblGrid>
+        <w:gridCol w:w="2268"/>
+        <w:gridCol w:w="2268"/>
+        <w:gridCol w:w="2268"/>
+        <w:gridCol w:w="2268"/>
+      </w:tblGrid>
+      <w:tr>
+        <w:tc>
+          <w:tcPr>
+            <w:tcW w:type="dxa" w:w="2268"/>
+          </w:tcPr>
+          <w:p>
+            <w:r>
+              <w:rPr>
+                <w:b/>
+                <w:sz w:val="20"/>
+              </w:rPr>
+              <w:t>Option</w:t>
+            </w:r>
+          </w:p>
+        </w:tc>
+        <w:tc>
+          <w:tcPr>
+            <w:tcW w:type="dxa" w:w="2268"/>
+          </w:tcPr>
+          <w:p>
+            <w:r>
+              <w:rPr>
+                <w:b/>
+                <w:sz w:val="20"/>
+              </w:rPr>
+              <w:t>Title</w:t>
+            </w:r>
+          </w:p>
+        </w:tc>
+        <w:tc>
+          <w:tcPr>
+            <w:tcW w:type="dxa" w:w="2268"/>
+          </w:tcPr>
+          <w:p>
+            <w:r>
+              <w:rPr>
+                <w:b/>
+                <w:sz w:val="20"/>
+              </w:rPr>
+              <w:t>Description</w:t>
+            </w:r>
+          </w:p>
+        </w:tc>
+        <w:tc>
+          <w:tcPr>
+            <w:tcW w:type="dxa" w:w="2268"/>
+          </w:tcPr>
+          <w:p>
+            <w:r>
+              <w:rPr>
+                <w:b/>
+                <w:sz w:val="20"/>
+              </w:rPr>
+              <w:t>Key Impacts</w:t>
+            </w:r>
+          </w:p>
+        </w:tc>
+      </w:tr>
+      <w:tr>
+        <w:tc>
+          <w:tcPr>
+            <w:tcW w:type="dxa" w:w="2268"/>
+          </w:tcPr>
+          <w:p>
+            <w:r>
+              <w:rPr>
+                <w:sz w:val="18"/>
+              </w:rPr>
+              <w:t>Integrated Value Creation</w:t>
+            </w:r>
+          </w:p>
+        </w:tc>
+        <w:tc>
+          <w:tcPr>
+            <w:tcW w:type="dxa" w:w="2268"/>
+          </w:tcPr>
+          <w:p>
+            <w:r>
+              <w:rPr>
+                <w:sz w:val="18"/>
+              </w:rPr>
+            </w:r>
+          </w:p>
+        </w:tc>
+        <w:tc>
+          <w:tcPr>
+            <w:tcW w:type="dxa" w:w="2268"/>
+          </w:tcPr>
+          <w:p>
+            <w:r>
+              <w:rPr>
+                <w:sz w:val="18"/>
+              </w:rPr>
+              <w:t>Codify the Universal Care Mandate into annual reporting. SDG alignment becomes a board-level governance obligation. Locks exit multiple at 12× and adds +0.35 to M_R.</w:t>
+            </w:r>
+          </w:p>
+        </w:tc>
+        <w:tc>
+          <w:tcPr>
+            <w:tcW w:type="dxa" w:w="2268"/>
+          </w:tcPr>
+          <w:p>
+            <w:r>
+              <w:rPr>
+                <w:sz w:val="18"/>
+              </w:rPr>
+              <w:t>treasury: $-8M</w:t>
+              <w:br/>
+              <w:t>reputation: +15</w:t>
+            </w:r>
+          </w:p>
+        </w:tc>
+      </w:tr>
+      <w:tr>
+        <w:tc>
+          <w:tcPr>
+            <w:tcW w:type="dxa" w:w="2268"/>
+          </w:tcPr>
+          <w:p>
+            <w:r>
+              <w:rPr>
+                <w:sz w:val="18"/>
+              </w:rPr>
+              <w:t>Strategic Integration</w:t>
+            </w:r>
+          </w:p>
+        </w:tc>
+        <w:tc>
+          <w:tcPr>
+            <w:tcW w:type="dxa" w:w="2268"/>
+          </w:tcPr>
+          <w:p>
+            <w:r>
+              <w:rPr>
+                <w:sz w:val="18"/>
+              </w:rPr>
+            </w:r>
+          </w:p>
+        </w:tc>
+        <w:tc>
+          <w:tcPr>
+            <w:tcW w:type="dxa" w:w="2268"/>
+          </w:tcPr>
+          <w:p>
+            <w:r>
+              <w:rPr>
+                <w:sz w:val="18"/>
+              </w:rPr>
+              <w:t>Enhanced Management Discussion &amp; Analysis with SDG mapping. Demonstrates strategic intent without full codification.</w:t>
+            </w:r>
+          </w:p>
+        </w:tc>
+        <w:tc>
+          <w:tcPr>
+            <w:tcW w:type="dxa" w:w="2268"/>
+          </w:tcPr>
+          <w:p>
+            <w:r>
+              <w:rPr>
+                <w:sz w:val="18"/>
+              </w:rPr>
+              <w:t>treasury: $-5M</w:t>
+              <w:br/>
+              <w:t>reputation: +6</w:t>
+            </w:r>
+          </w:p>
+        </w:tc>
+      </w:tr>
+      <w:tr>
+        <w:tc>
+          <w:tcPr>
+            <w:tcW w:type="dxa" w:w="2268"/>
+          </w:tcPr>
+          <w:p>
+            <w:r>
+              <w:rPr>
+                <w:sz w:val="18"/>
+              </w:rPr>
+              <w:t>Separate Supplement</w:t>
+            </w:r>
+          </w:p>
+        </w:tc>
+        <w:tc>
+          <w:tcPr>
+            <w:tcW w:type="dxa" w:w="2268"/>
+          </w:tcPr>
+          <w:p>
+            <w:r>
+              <w:rPr>
+                <w:sz w:val="18"/>
+              </w:rPr>
+            </w:r>
+          </w:p>
+        </w:tc>
+        <w:tc>
+          <w:tcPr>
+            <w:tcW w:type="dxa" w:w="2268"/>
+          </w:tcPr>
+          <w:p>
+            <w:r>
+              <w:rPr>
+                <w:sz w:val="18"/>
+              </w:rPr>
+              <w:t>Publish a standalone ESG report separate from financial statements. Signals that sustainability is not core strategy.</w:t>
+            </w:r>
+          </w:p>
+        </w:tc>
+        <w:tc>
+          <w:tcPr>
+            <w:tcW w:type="dxa" w:w="2268"/>
+          </w:tcPr>
+          <w:p>
+            <w:r>
+              <w:rPr>
+                <w:sz w:val="18"/>
+              </w:rPr>
+              <w:t>treasury: $-2M</w:t>
+              <w:br/>
+              <w:t>reputation: -3</w:t>
+            </w:r>
+          </w:p>
+        </w:tc>
+      </w:tr>
+    </w:tbl>
+    <w:p/>
+    <w:p>
+      <w:r>
+        <w:br w:type="page"/>
+      </w:r>
+    </w:p>
+    <w:p>
+      <w:pPr>
+        <w:pStyle w:val="Heading1"/>
+      </w:pPr>
+      <w:r>
+        <w:rPr>
+          <w:color w:val="1A1A2E"/>
+        </w:rPr>
+        <w:t>13. Mathematical Engine: Formulae &amp; Sample Calculations</w:t>
+      </w:r>
+    </w:p>
+    <w:p>
+      <w:r>
+        <w:rPr>
+          <w:b w:val="0"/>
+          <w:i w:val="0"/>
+          <w:sz w:val="22"/>
+        </w:rPr>
         <w:t>This section documents every formula used by the simulation engine (engine.py, round_logic.py, impact_engine.py). Each formula includes a worked example using representative game data.</w:t>
       </w:r>
     </w:p>
@@ -23908,7 +26758,7 @@
         <w:rPr>
           <w:color w:val="1A1A2E"/>
         </w:rPr>
-        <w:t>11.1 Corporate Strategic Fund (CSF)</w:t>
+        <w:t>15.1 Corporate Strategic Fund (CSF)</w:t>
       </w:r>
     </w:p>
     <w:p>
@@ -24011,7 +26861,7 @@
         <w:rPr>
           <w:color w:val="1A1A2E"/>
         </w:rPr>
-        <w:t>11.2 Contagion Engine (Sigmoid Model)</w:t>
+        <w:t>15.2 Contagion Engine (Sigmoid Model)</w:t>
       </w:r>
     </w:p>
     <w:p>
@@ -24114,7 +26964,7 @@
         <w:rPr>
           <w:color w:val="1A1A2E"/>
         </w:rPr>
-        <w:t>11.3 Synergy Engine (Diminishing Returns)</w:t>
+        <w:t>15.3 Synergy Engine (Diminishing Returns)</w:t>
       </w:r>
     </w:p>
     <w:p>
@@ -24206,7 +27056,7 @@
         <w:rPr>
           <w:color w:val="1A1A2E"/>
         </w:rPr>
-        <w:t>11.4 Natural Capital Cost of Debt</w:t>
+        <w:t>15.4 Natural Capital Cost of Debt</w:t>
       </w:r>
     </w:p>
     <w:p>
@@ -24298,7 +27148,7 @@
         <w:rPr>
           <w:color w:val="1A1A2E"/>
         </w:rPr>
-        <w:t>11.5 VRIO Decay Function</w:t>
+        <w:t>13.5 VRIO Decay Function</w:t>
       </w:r>
     </w:p>
     <w:p>
@@ -24379,7 +27229,7 @@
         <w:rPr>
           <w:color w:val="1A1A2E"/>
         </w:rPr>
-        <w:t>11.6 Talent Brain-Drain (Software/Telehealth BUs)</w:t>
+        <w:t>13.6 Talent Brain-Drain (Software/Telehealth BUs)</w:t>
       </w:r>
     </w:p>
     <w:p>
@@ -24482,7 +27332,7 @@
         <w:rPr>
           <w:color w:val="1A1A2E"/>
         </w:rPr>
-        <w:t>11.7 Strike Probability Engine (R9)</w:t>
+        <w:t>13.7 Strike Probability Engine (R9)</w:t>
       </w:r>
     </w:p>
     <w:p>
@@ -24585,7 +27435,7 @@
         <w:rPr>
           <w:color w:val="1A1A2E"/>
         </w:rPr>
-        <w:t>11.8 Natural Decay (Entropy)</w:t>
+        <w:t>13.8 Natural Decay (Entropy)</w:t>
       </w:r>
     </w:p>
     <w:p>
@@ -24677,7 +27527,7 @@
         <w:rPr>
           <w:color w:val="1A1A2E"/>
         </w:rPr>
-        <w:t>11.9 Macroeconomic Inflation</w:t>
+        <w:t>13.9 Macroeconomic Inflation</w:t>
       </w:r>
     </w:p>
     <w:p>
@@ -24758,7 +27608,7 @@
         <w:rPr>
           <w:color w:val="1A1A2E"/>
         </w:rPr>
-        <w:t>11.10 Execution Overrun Risk</w:t>
+        <w:t>13.10 Execution Overrun Risk</w:t>
       </w:r>
     </w:p>
     <w:p>
@@ -24839,7 +27689,7 @@
         <w:rPr>
           <w:color w:val="1A1A2E"/>
         </w:rPr>
-        <w:t>11.11 Technical Debt</w:t>
+        <w:t>13.11 Technical Debt</w:t>
       </w:r>
     </w:p>
     <w:p>
@@ -24920,7 +27770,7 @@
         <w:rPr>
           <w:color w:val="1A1A2E"/>
         </w:rPr>
-        <w:t>11.12 Revenue Cannibalization</w:t>
+        <w:t>13.12 Revenue Cannibalization</w:t>
       </w:r>
     </w:p>
     <w:p>
@@ -25001,7 +27851,7 @@
         <w:rPr>
           <w:color w:val="1A1A2E"/>
         </w:rPr>
-        <w:t>11.13 Stakeholder Fatigue</w:t>
+        <w:t>13.13 Stakeholder Fatigue</w:t>
       </w:r>
     </w:p>
     <w:p>
@@ -25082,7 +27932,7 @@
         <w:rPr>
           <w:color w:val="1A1A2E"/>
         </w:rPr>
-        <w:t>11.14 Burnout Accumulation</w:t>
+        <w:t>13.14 Burnout Accumulation</w:t>
       </w:r>
     </w:p>
     <w:p>
@@ -25174,7 +28024,7 @@
         <w:rPr>
           <w:color w:val="1A1A2E"/>
         </w:rPr>
-        <w:t>11.15 Workforce Readiness</w:t>
+        <w:t>13.15 Workforce Readiness</w:t>
       </w:r>
     </w:p>
     <w:p>
@@ -25266,7 +28116,7 @@
         <w:rPr>
           <w:color w:val="1A1A2E"/>
         </w:rPr>
-        <w:t>11.16 Cash Conversion / Working Capital</w:t>
+        <w:t>13.16 Cash Conversion / Working Capital</w:t>
       </w:r>
     </w:p>
     <w:p>
@@ -25347,7 +28197,7 @@
         <w:rPr>
           <w:color w:val="1A1A2E"/>
         </w:rPr>
-        <w:t>11.17 Dividend Ratchet</w:t>
+        <w:t>13.17 Dividend Ratchet</w:t>
       </w:r>
     </w:p>
     <w:p>
@@ -25428,7 +28278,7 @@
         <w:rPr>
           <w:color w:val="1A1A2E"/>
         </w:rPr>
-        <w:t>11.18 FX Risk Engine</w:t>
+        <w:t>13.18 FX Risk Engine</w:t>
       </w:r>
     </w:p>
     <w:p>
@@ -25509,7 +28359,7 @@
         <w:rPr>
           <w:color w:val="1A1A2E"/>
         </w:rPr>
-        <w:t>11.19 Macro Interest Rate Cycles</w:t>
+        <w:t>13.19 Macro Interest Rate Cycles</w:t>
       </w:r>
     </w:p>
     <w:p>
@@ -25601,7 +28451,7 @@
         <w:rPr>
           <w:color w:val="1A1A2E"/>
         </w:rPr>
-        <w:t>11.20 R5 Stochastic Climate Event</w:t>
+        <w:t>13.20 R5 Stochastic Climate Event</w:t>
       </w:r>
     </w:p>
     <w:p>
@@ -25704,7 +28554,7 @@
         <w:rPr>
           <w:color w:val="1A1A2E"/>
         </w:rPr>
-        <w:t>11.21 R9 Regulatory Friction</w:t>
+        <w:t>13.21 R9 Regulatory Friction</w:t>
       </w:r>
     </w:p>
     <w:p>
@@ -25796,7 +28646,7 @@
         <w:rPr>
           <w:color w:val="1A1A2E"/>
         </w:rPr>
-        <w:t>11.22 R10 Terminal Valuation (Grand Finale)</w:t>
+        <w:t>13.22 R10 Terminal Valuation (Grand Finale)</w:t>
       </w:r>
     </w:p>
     <w:p>
@@ -26785,7 +29635,7 @@
         <w:rPr>
           <w:color w:val="1A1A2E"/>
         </w:rPr>
-        <w:t>11.23 Strategic What-If Comparison</w:t>
+        <w:t>13.23 Strategic What-If Comparison</w:t>
       </w:r>
     </w:p>
     <w:p>
@@ -27028,13 +29878,13 @@
     </w:p>
     <w:p>
       <w:pPr>
-        <w:pStyle w:val="Heading1"/>
+        <w:pStyle w:val="Heading2"/>
       </w:pPr>
       <w:r>
         <w:rPr>
           <w:color w:val="1A1A2E"/>
         </w:rPr>
-        <w:t>12. Investment Matrix: How Capital Allocation Impacts Round Outcomes</w:t>
+        <w:t>13.24 Carbon-Adjusted Return on Invested Capital (CAROIC)</w:t>
       </w:r>
     </w:p>
     <w:p>
@@ -27044,18 +29894,23 @@
           <w:i w:val="0"/>
           <w:sz w:val="22"/>
         </w:rPr>
-        <w:t>The Investment Matrix is the primary capital allocation interface. Each round, players distribute their Corporate Strategic Fund (CSF) across Business Units using sliders. This section explains how those slider positions cascade through every engine calculation, with round-by-round examples.</w:t>
-      </w:r>
-    </w:p>
-    <w:p>
-      <w:pPr>
-        <w:pStyle w:val="Heading2"/>
-      </w:pPr>
-      <w:r>
-        <w:rPr>
-          <w:color w:val="1A1A2E"/>
-        </w:rPr>
-        <w:t>12.1 Investment Matrix Mechanics</w:t>
+        <w:t>CAROIC measures not just the return on capital, but the efficiency of carbon usage. It extends traditional ROIC by incorporating a shadow carbon cost into the capital base, making it impossible to achieve a high CAROIC while maintaining high carbon intensity. This bridges the gap between financial and environmental KPIs — a key pedagogical innovation.</w:t>
+      </w:r>
+    </w:p>
+    <w:p>
+      <w:r>
+        <w:rPr>
+          <w:b/>
+          <w:sz w:val="22"/>
+        </w:rPr>
+        <w:t xml:space="preserve">Formula: </w:t>
+      </w:r>
+      <w:r>
+        <w:rPr>
+          <w:rFonts w:ascii="Consolas" w:hAnsi="Consolas"/>
+          <w:sz w:val="20"/>
+        </w:rPr>
+        <w:t>CAROIC = EBITDA × (1 − Tax Rate) / (Invested Capital + (Carbon Tonnage × Shadow Carbon Price))</w:t>
       </w:r>
     </w:p>
     <w:p>
@@ -27065,51 +29920,95 @@
           <w:i w:val="0"/>
           <w:sz w:val="22"/>
         </w:rPr>
-        <w:t>Slider Inputs per BU:</w:t>
-      </w:r>
-    </w:p>
-    <w:p>
-      <w:pPr>
-        <w:pStyle w:val="ListBullet"/>
-      </w:pPr>
-      <w:r>
-        <w:rPr>
-          <w:sz w:val="22"/>
-        </w:rPr>
-        <w:t>Investment Ratio (0.0 to 1.0): The fraction of a BU's revenue base allocated as CAPEX. Slider position = percentage.</w:t>
-      </w:r>
-    </w:p>
-    <w:p>
-      <w:pPr>
-        <w:pStyle w:val="ListBullet"/>
-      </w:pPr>
-      <w:r>
-        <w:rPr>
-          <w:sz w:val="22"/>
-        </w:rPr>
-        <w:t>CAPEX Allocated ($): The dollar amount = Investment Ratio * BU Revenue. This is deducted from the CSF pool.</w:t>
-      </w:r>
-    </w:p>
-    <w:p>
-      <w:pPr>
-        <w:pStyle w:val="ListBullet"/>
-      </w:pPr>
-      <w:r>
-        <w:rPr>
-          <w:sz w:val="22"/>
-        </w:rPr>
-        <w:t>Total Allocation Cap: Total CAPEX across all BUs cannot exceed 120% of CSF pool. Above 100% triggers a loan at 12% interest.</w:t>
-      </w:r>
-    </w:p>
-    <w:p>
-      <w:pPr>
-        <w:pStyle w:val="ListBullet"/>
-      </w:pPr>
-      <w:r>
-        <w:rPr>
-          <w:sz w:val="22"/>
-        </w:rPr>
-        <w:t>Emergency Credit: If the 120% cap is still insufficient, an additional $1M emergency line is available at prevailing rate + 2%.</w:t>
+        <w:t>Component Definitions:</w:t>
+      </w:r>
+    </w:p>
+    <w:p>
+      <w:pPr>
+        <w:pStyle w:val="ListBullet"/>
+      </w:pPr>
+      <w:r>
+        <w:rPr>
+          <w:sz w:val="22"/>
+        </w:rPr>
+        <w:t>EBITDA: Group-level Earnings Before Interest, Tax, Depreciation &amp; Amortisation = Σ(Revenue_i − OPEX_i)</w:t>
+      </w:r>
+    </w:p>
+    <w:p>
+      <w:pPr>
+        <w:pStyle w:val="ListBullet"/>
+      </w:pPr>
+      <w:r>
+        <w:rPr>
+          <w:sz w:val="22"/>
+        </w:rPr>
+        <w:t>Tax Rate: Effective corporate tax rate (default 25%, clamped to [0%, 100%])</w:t>
+      </w:r>
+    </w:p>
+    <w:p>
+      <w:pPr>
+        <w:pStyle w:val="ListBullet"/>
+      </w:pPr>
+      <w:r>
+        <w:rPr>
+          <w:sz w:val="22"/>
+        </w:rPr>
+        <w:t>NOPAT: Net Operating Profit After Tax = EBITDA × (1 − Tax Rate)</w:t>
+      </w:r>
+    </w:p>
+    <w:p>
+      <w:pPr>
+        <w:pStyle w:val="ListBullet"/>
+      </w:pPr>
+      <w:r>
+        <w:rPr>
+          <w:sz w:val="22"/>
+        </w:rPr>
+        <w:t>Invested Capital: Corporate Treasury (proxy for total capital deployed). Floored at $0 to prevent sign-flip distortions</w:t>
+      </w:r>
+    </w:p>
+    <w:p>
+      <w:pPr>
+        <w:pStyle w:val="ListBullet"/>
+      </w:pPr>
+      <w:r>
+        <w:rPr>
+          <w:sz w:val="22"/>
+        </w:rPr>
+        <w:t>Carbon Tonnage: Σ(BU_Carbon_Intensity × BU_Revenue / 1,000,000) — same formula as terminal valuation</w:t>
+      </w:r>
+    </w:p>
+    <w:p>
+      <w:pPr>
+        <w:pStyle w:val="ListBullet"/>
+      </w:pPr>
+      <w:r>
+        <w:rPr>
+          <w:sz w:val="22"/>
+        </w:rPr>
+        <w:t>Shadow Carbon Price: Internal carbon price per ton (default $250, aligned with R10 carbon_tax_per_ton)</w:t>
+      </w:r>
+    </w:p>
+    <w:p>
+      <w:pPr>
+        <w:pStyle w:val="ListBullet"/>
+      </w:pPr>
+      <w:r>
+        <w:rPr>
+          <w:sz w:val="22"/>
+        </w:rPr>
+        <w:t>Carbon Capital Charge: Carbon Tonnage × Shadow Carbon Price — the "carbon penalty" on the denominator</w:t>
+      </w:r>
+    </w:p>
+    <w:p>
+      <w:pPr>
+        <w:pStyle w:val="ListBullet"/>
+      </w:pPr>
+      <w:r>
+        <w:rPr>
+          <w:sz w:val="22"/>
+        </w:rPr>
+        <w:t>Adjusted Capital: Invested Capital + Carbon Capital Charge</w:t>
       </w:r>
     </w:p>
     <w:p>
@@ -27119,6 +30018,624 @@
           <w:i w:val="0"/>
           <w:sz w:val="22"/>
         </w:rPr>
+        <w:t>Pedagogical Significance:</w:t>
+      </w:r>
+    </w:p>
+    <w:p>
+      <w:r>
+        <w:rPr>
+          <w:b w:val="0"/>
+          <w:i w:val="0"/>
+          <w:sz w:val="22"/>
+        </w:rPr>
+        <w:t>Traditional ROIC rewards pure financial efficiency without regard for environmental externalities. CAROIC introduces a shadow carbon cost that inflates the effective capital base of carbon-intensive firms, revealing the true cost of carbon dependence. A company achieving 15% ROIC but carrying significant carbon exposure will see its CAROIC compressed dramatically — making visible the "hidden tax" of carbon intensity before regulatory enforcement materialises.</w:t>
+      </w:r>
+    </w:p>
+    <w:p>
+      <w:r>
+        <w:rPr>
+          <w:b/>
+          <w:i w:val="0"/>
+          <w:sz w:val="22"/>
+        </w:rPr>
+        <w:t>Edge Case Handling:</w:t>
+      </w:r>
+    </w:p>
+    <w:p>
+      <w:pPr>
+        <w:pStyle w:val="ListBullet"/>
+      </w:pPr>
+      <w:r>
+        <w:rPr>
+          <w:sz w:val="22"/>
+        </w:rPr>
+        <w:t>Zero invested capital + zero carbon: CAROIC returns 0.0 (avoids division by zero)</w:t>
+      </w:r>
+    </w:p>
+    <w:p>
+      <w:pPr>
+        <w:pStyle w:val="ListBullet"/>
+      </w:pPr>
+      <w:r>
+        <w:rPr>
+          <w:sz w:val="22"/>
+        </w:rPr>
+        <w:t>Negative EBITDA: CAROIC returns a negative value with grade "F"</w:t>
+      </w:r>
+    </w:p>
+    <w:p>
+      <w:pPr>
+        <w:pStyle w:val="ListBullet"/>
+      </w:pPr>
+      <w:r>
+        <w:rPr>
+          <w:sz w:val="22"/>
+        </w:rPr>
+        <w:t>Zero carbon tonnage: Carbon Capital Charge = $0, CAROIC = pure ROIC</w:t>
+      </w:r>
+    </w:p>
+    <w:p>
+      <w:pPr>
+        <w:pStyle w:val="ListBullet"/>
+      </w:pPr>
+      <w:r>
+        <w:rPr>
+          <w:sz w:val="22"/>
+        </w:rPr>
+        <w:t>Negative treasury: Invested capital floored at $0 — carbon charge alone forms the denominator</w:t>
+      </w:r>
+    </w:p>
+    <w:p>
+      <w:r>
+        <w:rPr>
+          <w:b/>
+          <w:i w:val="0"/>
+          <w:sz w:val="22"/>
+        </w:rPr>
+        <w:t>Worked Example 1 — Strong Performer:</w:t>
+      </w:r>
+    </w:p>
+    <w:p>
+      <w:pPr>
+        <w:pStyle w:val="ListBullet"/>
+      </w:pPr>
+      <w:r>
+        <w:rPr>
+          <w:sz w:val="22"/>
+        </w:rPr>
+        <w:t>Given: EBITDA = $33M, Treasury = $50M, Carbon Tonnage = 2,850t, Shadow Price = $250/t</w:t>
+      </w:r>
+    </w:p>
+    <w:p>
+      <w:pPr>
+        <w:pStyle w:val="ListBullet"/>
+      </w:pPr>
+      <w:r>
+        <w:rPr>
+          <w:sz w:val="22"/>
+        </w:rPr>
+        <w:t>NOPAT = $33M × (1 − 0.25) = $24.75M</w:t>
+      </w:r>
+    </w:p>
+    <w:p>
+      <w:pPr>
+        <w:pStyle w:val="ListBullet"/>
+      </w:pPr>
+      <w:r>
+        <w:rPr>
+          <w:sz w:val="22"/>
+        </w:rPr>
+        <w:t>Carbon Capital Charge = 2,850 × $250 = $712,500</w:t>
+      </w:r>
+    </w:p>
+    <w:p>
+      <w:pPr>
+        <w:pStyle w:val="ListBullet"/>
+      </w:pPr>
+      <w:r>
+        <w:rPr>
+          <w:sz w:val="22"/>
+        </w:rPr>
+        <w:t>Adjusted Capital = $50M + $0.7125M = $50.7125M</w:t>
+      </w:r>
+    </w:p>
+    <w:p>
+      <w:pPr>
+        <w:pStyle w:val="ListBullet"/>
+      </w:pPr>
+      <w:r>
+        <w:rPr>
+          <w:sz w:val="22"/>
+        </w:rPr>
+        <w:t>CAROIC = $24.75M / $50.7125M = 0.4881 = 48.81% → Grade A+</w:t>
+      </w:r>
+    </w:p>
+    <w:p>
+      <w:r>
+        <w:rPr>
+          <w:b/>
+          <w:i w:val="0"/>
+          <w:sz w:val="22"/>
+        </w:rPr>
+        <w:t>Worked Example 2 — Carbon-Heavy Company:</w:t>
+      </w:r>
+    </w:p>
+    <w:p>
+      <w:pPr>
+        <w:pStyle w:val="ListBullet"/>
+      </w:pPr>
+      <w:r>
+        <w:rPr>
+          <w:sz w:val="22"/>
+        </w:rPr>
+        <w:t>Given: EBITDA = $33M, Treasury = $50M, Carbon Tonnage = 12,000t, Shadow Price = $250/t</w:t>
+      </w:r>
+    </w:p>
+    <w:p>
+      <w:pPr>
+        <w:pStyle w:val="ListBullet"/>
+      </w:pPr>
+      <w:r>
+        <w:rPr>
+          <w:sz w:val="22"/>
+        </w:rPr>
+        <w:t>NOPAT = $24.75M</w:t>
+      </w:r>
+    </w:p>
+    <w:p>
+      <w:pPr>
+        <w:pStyle w:val="ListBullet"/>
+      </w:pPr>
+      <w:r>
+        <w:rPr>
+          <w:sz w:val="22"/>
+        </w:rPr>
+        <w:t>Carbon Capital Charge = 12,000 × $250 = $3,000,000</w:t>
+      </w:r>
+    </w:p>
+    <w:p>
+      <w:pPr>
+        <w:pStyle w:val="ListBullet"/>
+      </w:pPr>
+      <w:r>
+        <w:rPr>
+          <w:sz w:val="22"/>
+        </w:rPr>
+        <w:t>Adjusted Capital = $50M + $3M = $53M</w:t>
+      </w:r>
+    </w:p>
+    <w:p>
+      <w:pPr>
+        <w:pStyle w:val="ListBullet"/>
+      </w:pPr>
+      <w:r>
+        <w:rPr>
+          <w:sz w:val="22"/>
+        </w:rPr>
+        <w:t>CAROIC = $24.75M / $53M = 0.4670 = 46.70% → Grade A+</w:t>
+      </w:r>
+    </w:p>
+    <w:p>
+      <w:pPr>
+        <w:pStyle w:val="ListBullet"/>
+      </w:pPr>
+      <w:r>
+        <w:rPr>
+          <w:sz w:val="22"/>
+        </w:rPr>
+        <w:t>Note: Despite same EBITDA, higher carbon tonnage compresses CAROIC by ~2.1 percentage points</w:t>
+      </w:r>
+    </w:p>
+    <w:p>
+      <w:r>
+        <w:rPr>
+          <w:b w:val="0"/>
+          <w:i w:val="0"/>
+          <w:sz w:val="22"/>
+        </w:rPr>
+      </w:r>
+    </w:p>
+    <w:tbl>
+      <w:tblPr>
+        <w:tblStyle w:val="LightGrid-Accent1"/>
+        <w:tblW w:type="auto" w:w="0"/>
+        <w:tblLook w:firstColumn="1" w:firstRow="1" w:lastColumn="0" w:lastRow="0" w:noHBand="0" w:noVBand="1" w:val="04A0"/>
+      </w:tblPr>
+      <w:tblGrid>
+        <w:gridCol w:w="3024"/>
+        <w:gridCol w:w="3024"/>
+        <w:gridCol w:w="3024"/>
+      </w:tblGrid>
+      <w:tr>
+        <w:tc>
+          <w:tcPr>
+            <w:tcW w:type="dxa" w:w="3024"/>
+          </w:tcPr>
+          <w:p>
+            <w:r>
+              <w:rPr>
+                <w:b/>
+                <w:sz w:val="18"/>
+              </w:rPr>
+              <w:t>Grade</w:t>
+            </w:r>
+          </w:p>
+        </w:tc>
+        <w:tc>
+          <w:tcPr>
+            <w:tcW w:type="dxa" w:w="3024"/>
+          </w:tcPr>
+          <w:p>
+            <w:r>
+              <w:rPr>
+                <w:b/>
+                <w:sz w:val="18"/>
+              </w:rPr>
+              <w:t>CAROIC %</w:t>
+            </w:r>
+          </w:p>
+        </w:tc>
+        <w:tc>
+          <w:tcPr>
+            <w:tcW w:type="dxa" w:w="3024"/>
+          </w:tcPr>
+          <w:p>
+            <w:r>
+              <w:rPr>
+                <w:b/>
+                <w:sz w:val="18"/>
+              </w:rPr>
+              <w:t>Interpretation</w:t>
+            </w:r>
+          </w:p>
+        </w:tc>
+      </w:tr>
+      <w:tr>
+        <w:tc>
+          <w:tcPr>
+            <w:tcW w:type="dxa" w:w="3024"/>
+          </w:tcPr>
+          <w:p>
+            <w:r>
+              <w:rPr>
+                <w:sz w:val="18"/>
+              </w:rPr>
+              <w:t>A+</w:t>
+            </w:r>
+          </w:p>
+        </w:tc>
+        <w:tc>
+          <w:tcPr>
+            <w:tcW w:type="dxa" w:w="3024"/>
+          </w:tcPr>
+          <w:p>
+            <w:r>
+              <w:rPr>
+                <w:sz w:val="18"/>
+              </w:rPr>
+              <w:t>≥ 25%</w:t>
+            </w:r>
+          </w:p>
+        </w:tc>
+        <w:tc>
+          <w:tcPr>
+            <w:tcW w:type="dxa" w:w="3024"/>
+          </w:tcPr>
+          <w:p>
+            <w:r>
+              <w:rPr>
+                <w:sz w:val="18"/>
+              </w:rPr>
+              <w:t>Exceptional capital-carbon efficiency. Minimal carbon drag on returns.</w:t>
+            </w:r>
+          </w:p>
+        </w:tc>
+      </w:tr>
+      <w:tr>
+        <w:tc>
+          <w:tcPr>
+            <w:tcW w:type="dxa" w:w="3024"/>
+          </w:tcPr>
+          <w:p>
+            <w:r>
+              <w:rPr>
+                <w:sz w:val="18"/>
+              </w:rPr>
+              <w:t>A</w:t>
+            </w:r>
+          </w:p>
+        </w:tc>
+        <w:tc>
+          <w:tcPr>
+            <w:tcW w:type="dxa" w:w="3024"/>
+          </w:tcPr>
+          <w:p>
+            <w:r>
+              <w:rPr>
+                <w:sz w:val="18"/>
+              </w:rPr>
+              <w:t>≥ 15%</w:t>
+            </w:r>
+          </w:p>
+        </w:tc>
+        <w:tc>
+          <w:tcPr>
+            <w:tcW w:type="dxa" w:w="3024"/>
+          </w:tcPr>
+          <w:p>
+            <w:r>
+              <w:rPr>
+                <w:sz w:val="18"/>
+              </w:rPr>
+              <w:t>Strong carbon-adjusted returns. Carbon transition well-managed.</w:t>
+            </w:r>
+          </w:p>
+        </w:tc>
+      </w:tr>
+      <w:tr>
+        <w:tc>
+          <w:tcPr>
+            <w:tcW w:type="dxa" w:w="3024"/>
+          </w:tcPr>
+          <w:p>
+            <w:r>
+              <w:rPr>
+                <w:sz w:val="18"/>
+              </w:rPr>
+              <w:t>B</w:t>
+            </w:r>
+          </w:p>
+        </w:tc>
+        <w:tc>
+          <w:tcPr>
+            <w:tcW w:type="dxa" w:w="3024"/>
+          </w:tcPr>
+          <w:p>
+            <w:r>
+              <w:rPr>
+                <w:sz w:val="18"/>
+              </w:rPr>
+              <w:t>≥ 10%</w:t>
+            </w:r>
+          </w:p>
+        </w:tc>
+        <w:tc>
+          <w:tcPr>
+            <w:tcW w:type="dxa" w:w="3024"/>
+          </w:tcPr>
+          <w:p>
+            <w:r>
+              <w:rPr>
+                <w:sz w:val="18"/>
+              </w:rPr>
+              <w:t>Solid returns despite carbon drag. Room for decarbonisation gains.</w:t>
+            </w:r>
+          </w:p>
+        </w:tc>
+      </w:tr>
+      <w:tr>
+        <w:tc>
+          <w:tcPr>
+            <w:tcW w:type="dxa" w:w="3024"/>
+          </w:tcPr>
+          <w:p>
+            <w:r>
+              <w:rPr>
+                <w:sz w:val="18"/>
+              </w:rPr>
+              <w:t>C</w:t>
+            </w:r>
+          </w:p>
+        </w:tc>
+        <w:tc>
+          <w:tcPr>
+            <w:tcW w:type="dxa" w:w="3024"/>
+          </w:tcPr>
+          <w:p>
+            <w:r>
+              <w:rPr>
+                <w:sz w:val="18"/>
+              </w:rPr>
+              <w:t>≥ 5%</w:t>
+            </w:r>
+          </w:p>
+        </w:tc>
+        <w:tc>
+          <w:tcPr>
+            <w:tcW w:type="dxa" w:w="3024"/>
+          </w:tcPr>
+          <w:p>
+            <w:r>
+              <w:rPr>
+                <w:sz w:val="18"/>
+              </w:rPr>
+              <w:t>Moderate returns eroded by carbon intensity. Transition urgency rising.</w:t>
+            </w:r>
+          </w:p>
+        </w:tc>
+      </w:tr>
+      <w:tr>
+        <w:tc>
+          <w:tcPr>
+            <w:tcW w:type="dxa" w:w="3024"/>
+          </w:tcPr>
+          <w:p>
+            <w:r>
+              <w:rPr>
+                <w:sz w:val="18"/>
+              </w:rPr>
+              <w:t>D</w:t>
+            </w:r>
+          </w:p>
+        </w:tc>
+        <w:tc>
+          <w:tcPr>
+            <w:tcW w:type="dxa" w:w="3024"/>
+          </w:tcPr>
+          <w:p>
+            <w:r>
+              <w:rPr>
+                <w:sz w:val="18"/>
+              </w:rPr>
+              <w:t>≥ 0%</w:t>
+            </w:r>
+          </w:p>
+        </w:tc>
+        <w:tc>
+          <w:tcPr>
+            <w:tcW w:type="dxa" w:w="3024"/>
+          </w:tcPr>
+          <w:p>
+            <w:r>
+              <w:rPr>
+                <w:sz w:val="18"/>
+              </w:rPr>
+              <w:t>Carbon burden severely depresses returns. Stranded asset risk.</w:t>
+            </w:r>
+          </w:p>
+        </w:tc>
+      </w:tr>
+      <w:tr>
+        <w:tc>
+          <w:tcPr>
+            <w:tcW w:type="dxa" w:w="3024"/>
+          </w:tcPr>
+          <w:p>
+            <w:r>
+              <w:rPr>
+                <w:sz w:val="18"/>
+              </w:rPr>
+              <w:t>F</w:t>
+            </w:r>
+          </w:p>
+        </w:tc>
+        <w:tc>
+          <w:tcPr>
+            <w:tcW w:type="dxa" w:w="3024"/>
+          </w:tcPr>
+          <w:p>
+            <w:r>
+              <w:rPr>
+                <w:sz w:val="18"/>
+              </w:rPr>
+              <w:t>&lt; 0%</w:t>
+            </w:r>
+          </w:p>
+        </w:tc>
+        <w:tc>
+          <w:tcPr>
+            <w:tcW w:type="dxa" w:w="3024"/>
+          </w:tcPr>
+          <w:p>
+            <w:r>
+              <w:rPr>
+                <w:sz w:val="18"/>
+              </w:rPr>
+              <w:t>Negative CAROIC: operating losses compounded by carbon liability.</w:t>
+            </w:r>
+          </w:p>
+        </w:tc>
+      </w:tr>
+    </w:tbl>
+    <w:p/>
+    <w:p>
+      <w:r>
+        <w:br w:type="page"/>
+      </w:r>
+    </w:p>
+    <w:p>
+      <w:pPr>
+        <w:pStyle w:val="Heading1"/>
+      </w:pPr>
+      <w:r>
+        <w:rPr>
+          <w:color w:val="1A1A2E"/>
+        </w:rPr>
+        <w:t>14. Investment Matrix: How Capital Allocation Impacts Round Outcomes</w:t>
+      </w:r>
+    </w:p>
+    <w:p>
+      <w:r>
+        <w:rPr>
+          <w:b w:val="0"/>
+          <w:i w:val="0"/>
+          <w:sz w:val="22"/>
+        </w:rPr>
+        <w:t>The Investment Matrix is the primary capital allocation interface. Each round, players distribute their Corporate Strategic Fund (CSF) across Business Units using sliders. This section explains how those slider positions cascade through every engine calculation, with round-by-round examples.</w:t>
+      </w:r>
+    </w:p>
+    <w:p>
+      <w:pPr>
+        <w:pStyle w:val="Heading2"/>
+      </w:pPr>
+      <w:r>
+        <w:rPr>
+          <w:color w:val="1A1A2E"/>
+        </w:rPr>
+        <w:t>14.1 Investment Matrix Mechanics</w:t>
+      </w:r>
+    </w:p>
+    <w:p>
+      <w:r>
+        <w:rPr>
+          <w:b/>
+          <w:i w:val="0"/>
+          <w:sz w:val="22"/>
+        </w:rPr>
+        <w:t>Slider Inputs per BU:</w:t>
+      </w:r>
+    </w:p>
+    <w:p>
+      <w:pPr>
+        <w:pStyle w:val="ListBullet"/>
+      </w:pPr>
+      <w:r>
+        <w:rPr>
+          <w:sz w:val="22"/>
+        </w:rPr>
+        <w:t>Investment Ratio (0.0 to 1.0): The fraction of a BU's revenue base allocated as CAPEX. Slider position = percentage.</w:t>
+      </w:r>
+    </w:p>
+    <w:p>
+      <w:pPr>
+        <w:pStyle w:val="ListBullet"/>
+      </w:pPr>
+      <w:r>
+        <w:rPr>
+          <w:sz w:val="22"/>
+        </w:rPr>
+        <w:t>CAPEX Allocated ($): The dollar amount = Investment Ratio * BU Revenue. This is deducted from the CSF pool.</w:t>
+      </w:r>
+    </w:p>
+    <w:p>
+      <w:pPr>
+        <w:pStyle w:val="ListBullet"/>
+      </w:pPr>
+      <w:r>
+        <w:rPr>
+          <w:sz w:val="22"/>
+        </w:rPr>
+        <w:t>Total Allocation Cap: Total CAPEX across all BUs cannot exceed 120% of CSF pool. Above 100% triggers a loan at 12% interest.</w:t>
+      </w:r>
+    </w:p>
+    <w:p>
+      <w:pPr>
+        <w:pStyle w:val="ListBullet"/>
+      </w:pPr>
+      <w:r>
+        <w:rPr>
+          <w:sz w:val="22"/>
+        </w:rPr>
+        <w:t>Emergency Credit: If the 120% cap is still insufficient, an additional $1M emergency line is available at prevailing rate + 2%.</w:t>
+      </w:r>
+    </w:p>
+    <w:p>
+      <w:r>
+        <w:rPr>
+          <w:b/>
+          <w:i w:val="0"/>
+          <w:sz w:val="22"/>
+        </w:rPr>
         <w:t>Processing Pipeline:</w:t>
       </w:r>
     </w:p>
@@ -27296,7 +30813,7 @@
         <w:rPr>
           <w:color w:val="1A1A2E"/>
         </w:rPr>
-        <w:t>12.2 Worked Example: Three Investment Strategies Compared</w:t>
+        <w:t>14.2 Worked Example: Three Investment Strategies Compared</w:t>
       </w:r>
     </w:p>
     <w:p>
@@ -27820,7 +31337,7 @@
         <w:rPr>
           <w:color w:val="1A1A2E"/>
         </w:rPr>
-        <w:t>12.3 OPEX Reduction: How Investment Ratio Drives Synergy</w:t>
+        <w:t>14.3 OPEX Reduction: How Investment Ratio Drives Synergy</w:t>
       </w:r>
     </w:p>
     <w:p>
@@ -28449,7 +31966,7 @@
         <w:rPr>
           <w:color w:val="1A1A2E"/>
         </w:rPr>
-        <w:t>12.4 Neglect Cascade: The Cost of Zero Investment</w:t>
+        <w:t>14.4 Neglect Cascade: The Cost of Zero Investment</w:t>
       </w:r>
     </w:p>
     <w:p>
@@ -28886,7 +32403,7 @@
         <w:rPr>
           <w:color w:val="1A1A2E"/>
         </w:rPr>
-        <w:t>12.5 Round-Specific Investment Effects</w:t>
+        <w:t>14.5 Round-Specific Investment Effects</w:t>
       </w:r>
     </w:p>
     <w:p>
@@ -29374,7 +32891,7 @@
         <w:rPr>
           <w:color w:val="1A1A2E"/>
         </w:rPr>
-        <w:t>12.6 Investment Strategy vs Terminal Value: Full Lifecycle Comparison</w:t>
+        <w:t>14.6 Investment Strategy vs Terminal Value: Full Lifecycle Comparison</w:t>
       </w:r>
     </w:p>
     <w:p>
@@ -30103,7 +33620,7 @@
         <w:rPr>
           <w:color w:val="1A1A2E"/>
         </w:rPr>
-        <w:t>13. Investment-to-Score Rationale: Why Investment Improves Player Scores</w:t>
+        <w:t>15. Investment-to-Score Rationale: Why Investment Improves Player Scores</w:t>
       </w:r>
     </w:p>
     <w:p>
@@ -30124,7 +33641,7 @@
         <w:rPr>
           <w:color w:val="1A1A2E"/>
         </w:rPr>
-        <w:t>13.1 The Six Competency Dimensions &amp; Their Formulas</w:t>
+        <w:t>15.1 The Six Competency Dimensions &amp; Their Formulas</w:t>
       </w:r>
     </w:p>
     <w:p>
@@ -30541,7 +34058,7 @@
         <w:rPr>
           <w:color w:val="1A1A2E"/>
         </w:rPr>
-        <w:t>13.2 Causal Chains: Slider -&gt; Engine -&gt; Metric -&gt; Score</w:t>
+        <w:t>15.2 Causal Chains: Slider -&gt; Engine -&gt; Metric -&gt; Score</w:t>
       </w:r>
     </w:p>
     <w:p>
@@ -31063,7 +34580,7 @@
         <w:rPr>
           <w:color w:val="1A1A2E"/>
         </w:rPr>
-        <w:t>13.3 Optimal Investment Roadmap for Maximum Scores</w:t>
+        <w:t>15.3 Optimal Investment Roadmap for Maximum Scores</w:t>
       </w:r>
     </w:p>
     <w:p>
@@ -31841,7 +35358,7 @@
         <w:rPr>
           <w:color w:val="1A1A2E"/>
         </w:rPr>
-        <w:t>13.4 Expected Scores: Optimal vs Neglect Comparison</w:t>
+        <w:t>15.4 Expected Scores: Optimal vs Neglect Comparison</w:t>
       </w:r>
     </w:p>
     <w:p>
@@ -32816,7 +36333,7 @@
         <w:rPr>
           <w:color w:val="1A1A2E"/>
         </w:rPr>
-        <w:t>14. Full Game Walkthrough: Climate Black Swan (Rounds 1-10)</w:t>
+        <w:t>16. Full Game Walkthrough: Climate Black Swan (Rounds 1-10)</w:t>
       </w:r>
     </w:p>
     <w:p>
@@ -32837,7 +36354,7 @@
         <w:rPr>
           <w:color w:val="1A1A2E"/>
         </w:rPr>
-        <w:t>14.1 Round 1: Foundations — ESG Baseline Assessment</w:t>
+        <w:t>16.1 Round 1: Foundations — ESG Baseline Assessment</w:t>
       </w:r>
     </w:p>
     <w:p>
@@ -32980,7 +36497,7 @@
         <w:rPr>
           <w:color w:val="1A1A2E"/>
         </w:rPr>
-        <w:t>14.2 Round 2: Double Materiality — CSRD Alignment</w:t>
+        <w:t>16.2 Round 2: Double Materiality — CSRD Alignment</w:t>
       </w:r>
     </w:p>
     <w:p>
@@ -33123,7 +36640,7 @@
         <w:rPr>
           <w:color w:val="1A1A2E"/>
         </w:rPr>
-        <w:t>14.3 Round 3: Scope 3 Emissions — Supply Chain Decarbonisation</w:t>
+        <w:t>16.3 Round 3: Scope 3 Emissions — Supply Chain Decarbonisation</w:t>
       </w:r>
     </w:p>
     <w:p>
@@ -33255,7 +36772,7 @@
         <w:rPr>
           <w:color w:val="1A1A2E"/>
         </w:rPr>
-        <w:t>14.4 Round 4: Contagion — Reputation Crisis Cascade</w:t>
+        <w:t>16.4 Round 4: Contagion — Reputation Crisis Cascade</w:t>
       </w:r>
     </w:p>
     <w:p>
@@ -33387,7 +36904,7 @@
         <w:rPr>
           <w:color w:val="1A1A2E"/>
         </w:rPr>
-        <w:t>14.5 Round 5: Climate — Physical Climate Risk Event</w:t>
+        <w:t>16.5 Round 5: Climate — Physical Climate Risk Event</w:t>
       </w:r>
     </w:p>
     <w:p>
@@ -33530,7 +37047,7 @@
         <w:rPr>
           <w:color w:val="1A1A2E"/>
         </w:rPr>
-        <w:t>14.6 Round 6: AI Bias — Algorithmic Ethics</w:t>
+        <w:t>16.6 Round 6: AI Bias — Algorithmic Ethics</w:t>
       </w:r>
     </w:p>
     <w:p>
@@ -33662,7 +37179,7 @@
         <w:rPr>
           <w:color w:val="1A1A2E"/>
         </w:rPr>
-        <w:t>14.7 Round 7: Circularity — Circular Economy Transition</w:t>
+        <w:t>16.7 Round 7: Circularity — Circular Economy Transition</w:t>
       </w:r>
     </w:p>
     <w:p>
@@ -33805,7 +37322,7 @@
         <w:rPr>
           <w:color w:val="1A1A2E"/>
         </w:rPr>
-        <w:t>14.8 Round 8: Blue Stress — Water Scarcity Emergency</w:t>
+        <w:t>16.8 Round 8: Blue Stress — Water Scarcity Emergency</w:t>
       </w:r>
     </w:p>
     <w:p>
@@ -33937,7 +37454,7 @@
         <w:rPr>
           <w:color w:val="1A1A2E"/>
         </w:rPr>
-        <w:t>14.9 Round 9: Just Transition — Workforce &amp; Community Justice</w:t>
+        <w:t>16.9 Round 9: Just Transition — Workforce &amp; Community Justice</w:t>
       </w:r>
     </w:p>
     <w:p>
@@ -34069,7 +37586,7 @@
         <w:rPr>
           <w:color w:val="1A1A2E"/>
         </w:rPr>
-        <w:t>14.10 Round 10: Grand Finale — Climate Black Swan: The Stranded Asset Reckoning</w:t>
+        <w:t>16.10 Round 10: Grand Finale — Climate Black Swan: The Stranded Asset Reckoning</w:t>
       </w:r>
     </w:p>
     <w:p>
@@ -34201,7 +37718,7 @@
         <w:rPr>
           <w:color w:val="1A1A2E"/>
         </w:rPr>
-        <w:t>14.11 Terminal Valuation Calculation</w:t>
+        <w:t>16.11 Terminal Valuation Calculation</w:t>
       </w:r>
     </w:p>
     <w:p>

</xml_diff>